<commit_message>
Update meeting log, item 3
</commit_message>
<xml_diff>
--- a/docs/EECS581_Team_Meeting_Log_Week1.docx
+++ b/docs/EECS581_Team_Meeting_Log_Week1.docx
@@ -35,7 +35,7 @@
     <w:p>
       <w:pPr>
         <w:pBdr>
-          <w:bottom w:val="single" w:sz="12" w:space="6" w:color="0051BA"/>
+          <w:bottom w:val="single" w:color="0051BA" w:sz="12" w:space="6"/>
         </w:pBdr>
         <w:spacing w:after="160"/>
       </w:pPr>
@@ -74,12 +74,12 @@
       <w:tblPr>
         <w:tblW w:w="9360" w:type="dxa"/>
         <w:tblBorders>
-          <w:top w:val="single" w:sz="4" w:space="0" w:color="auto"/>
-          <w:left w:val="single" w:sz="4" w:space="0" w:color="auto"/>
-          <w:bottom w:val="single" w:sz="4" w:space="0" w:color="auto"/>
-          <w:right w:val="single" w:sz="4" w:space="0" w:color="auto"/>
-          <w:insideH w:val="single" w:sz="4" w:space="0" w:color="auto"/>
-          <w:insideV w:val="single" w:sz="4" w:space="0" w:color="auto"/>
+          <w:top w:val="single" w:color="auto" w:sz="4" w:space="0"/>
+          <w:left w:val="single" w:color="auto" w:sz="4" w:space="0"/>
+          <w:bottom w:val="single" w:color="auto" w:sz="4" w:space="0"/>
+          <w:right w:val="single" w:color="auto" w:sz="4" w:space="0"/>
+          <w:insideH w:val="single" w:color="auto" w:sz="4" w:space="0"/>
+          <w:insideV w:val="single" w:color="auto" w:sz="4" w:space="0"/>
         </w:tblBorders>
         <w:tblCellMar>
           <w:left w:w="10" w:type="dxa"/>
@@ -99,10 +99,10 @@
           <w:tcPr>
             <w:tcW w:w="2400" w:type="dxa"/>
             <w:tcBorders>
-              <w:top w:val="single" w:sz="4" w:space="0" w:color="9AA5B1"/>
-              <w:left w:val="single" w:sz="4" w:space="0" w:color="9AA5B1"/>
-              <w:bottom w:val="single" w:sz="4" w:space="0" w:color="9AA5B1"/>
-              <w:right w:val="single" w:sz="4" w:space="0" w:color="9AA5B1"/>
+              <w:top w:val="single" w:color="9AA5B1" w:sz="4" w:space="0"/>
+              <w:left w:val="single" w:color="9AA5B1" w:sz="4" w:space="0"/>
+              <w:bottom w:val="single" w:color="9AA5B1" w:sz="4" w:space="0"/>
+              <w:right w:val="single" w:color="9AA5B1" w:sz="4" w:space="0"/>
             </w:tcBorders>
             <w:shd w:val="clear" w:color="auto" w:fill="E8EEF7"/>
             <w:tcMar>
@@ -128,10 +128,10 @@
           <w:tcPr>
             <w:tcW w:w="6960" w:type="dxa"/>
             <w:tcBorders>
-              <w:top w:val="single" w:sz="4" w:space="0" w:color="9AA5B1"/>
-              <w:left w:val="single" w:sz="4" w:space="0" w:color="9AA5B1"/>
-              <w:bottom w:val="single" w:sz="4" w:space="0" w:color="9AA5B1"/>
-              <w:right w:val="single" w:sz="4" w:space="0" w:color="9AA5B1"/>
+              <w:top w:val="single" w:color="9AA5B1" w:sz="4" w:space="0"/>
+              <w:left w:val="single" w:color="9AA5B1" w:sz="4" w:space="0"/>
+              <w:bottom w:val="single" w:color="9AA5B1" w:sz="4" w:space="0"/>
+              <w:right w:val="single" w:color="9AA5B1" w:sz="4" w:space="0"/>
             </w:tcBorders>
             <w:tcMar>
               <w:top w:w="40" w:type="dxa"/>
@@ -159,10 +159,10 @@
           <w:tcPr>
             <w:tcW w:w="2400" w:type="dxa"/>
             <w:tcBorders>
-              <w:top w:val="single" w:sz="4" w:space="0" w:color="9AA5B1"/>
-              <w:left w:val="single" w:sz="4" w:space="0" w:color="9AA5B1"/>
-              <w:bottom w:val="single" w:sz="4" w:space="0" w:color="9AA5B1"/>
-              <w:right w:val="single" w:sz="4" w:space="0" w:color="9AA5B1"/>
+              <w:top w:val="single" w:color="9AA5B1" w:sz="4" w:space="0"/>
+              <w:left w:val="single" w:color="9AA5B1" w:sz="4" w:space="0"/>
+              <w:bottom w:val="single" w:color="9AA5B1" w:sz="4" w:space="0"/>
+              <w:right w:val="single" w:color="9AA5B1" w:sz="4" w:space="0"/>
             </w:tcBorders>
             <w:shd w:val="clear" w:color="auto" w:fill="E8EEF7"/>
             <w:tcMar>
@@ -188,10 +188,10 @@
           <w:tcPr>
             <w:tcW w:w="6960" w:type="dxa"/>
             <w:tcBorders>
-              <w:top w:val="single" w:sz="4" w:space="0" w:color="9AA5B1"/>
-              <w:left w:val="single" w:sz="4" w:space="0" w:color="9AA5B1"/>
-              <w:bottom w:val="single" w:sz="4" w:space="0" w:color="9AA5B1"/>
-              <w:right w:val="single" w:sz="4" w:space="0" w:color="9AA5B1"/>
+              <w:top w:val="single" w:color="9AA5B1" w:sz="4" w:space="0"/>
+              <w:left w:val="single" w:color="9AA5B1" w:sz="4" w:space="0"/>
+              <w:bottom w:val="single" w:color="9AA5B1" w:sz="4" w:space="0"/>
+              <w:right w:val="single" w:color="9AA5B1" w:sz="4" w:space="0"/>
             </w:tcBorders>
             <w:tcMar>
               <w:top w:w="40" w:type="dxa"/>
@@ -222,10 +222,10 @@
           <w:tcPr>
             <w:tcW w:w="2400" w:type="dxa"/>
             <w:tcBorders>
-              <w:top w:val="single" w:sz="4" w:space="0" w:color="9AA5B1"/>
-              <w:left w:val="single" w:sz="4" w:space="0" w:color="9AA5B1"/>
-              <w:bottom w:val="single" w:sz="4" w:space="0" w:color="9AA5B1"/>
-              <w:right w:val="single" w:sz="4" w:space="0" w:color="9AA5B1"/>
+              <w:top w:val="single" w:color="9AA5B1" w:sz="4" w:space="0"/>
+              <w:left w:val="single" w:color="9AA5B1" w:sz="4" w:space="0"/>
+              <w:bottom w:val="single" w:color="9AA5B1" w:sz="4" w:space="0"/>
+              <w:right w:val="single" w:color="9AA5B1" w:sz="4" w:space="0"/>
             </w:tcBorders>
             <w:shd w:val="clear" w:color="auto" w:fill="E8EEF7"/>
             <w:tcMar>
@@ -251,10 +251,10 @@
           <w:tcPr>
             <w:tcW w:w="6960" w:type="dxa"/>
             <w:tcBorders>
-              <w:top w:val="single" w:sz="4" w:space="0" w:color="9AA5B1"/>
-              <w:left w:val="single" w:sz="4" w:space="0" w:color="9AA5B1"/>
-              <w:bottom w:val="single" w:sz="4" w:space="0" w:color="9AA5B1"/>
-              <w:right w:val="single" w:sz="4" w:space="0" w:color="9AA5B1"/>
+              <w:top w:val="single" w:color="9AA5B1" w:sz="4" w:space="0"/>
+              <w:left w:val="single" w:color="9AA5B1" w:sz="4" w:space="0"/>
+              <w:bottom w:val="single" w:color="9AA5B1" w:sz="4" w:space="0"/>
+              <w:right w:val="single" w:color="9AA5B1" w:sz="4" w:space="0"/>
             </w:tcBorders>
             <w:tcMar>
               <w:top w:w="40" w:type="dxa"/>
@@ -297,10 +297,10 @@
           <w:tcPr>
             <w:tcW w:w="2400" w:type="dxa"/>
             <w:tcBorders>
-              <w:top w:val="single" w:sz="4" w:space="0" w:color="9AA5B1"/>
-              <w:left w:val="single" w:sz="4" w:space="0" w:color="9AA5B1"/>
-              <w:bottom w:val="single" w:sz="4" w:space="0" w:color="9AA5B1"/>
-              <w:right w:val="single" w:sz="4" w:space="0" w:color="9AA5B1"/>
+              <w:top w:val="single" w:color="9AA5B1" w:sz="4" w:space="0"/>
+              <w:left w:val="single" w:color="9AA5B1" w:sz="4" w:space="0"/>
+              <w:bottom w:val="single" w:color="9AA5B1" w:sz="4" w:space="0"/>
+              <w:right w:val="single" w:color="9AA5B1" w:sz="4" w:space="0"/>
             </w:tcBorders>
             <w:shd w:val="clear" w:color="auto" w:fill="E8EEF7"/>
             <w:tcMar>
@@ -326,10 +326,10 @@
           <w:tcPr>
             <w:tcW w:w="6960" w:type="dxa"/>
             <w:tcBorders>
-              <w:top w:val="single" w:sz="4" w:space="0" w:color="9AA5B1"/>
-              <w:left w:val="single" w:sz="4" w:space="0" w:color="9AA5B1"/>
-              <w:bottom w:val="single" w:sz="4" w:space="0" w:color="9AA5B1"/>
-              <w:right w:val="single" w:sz="4" w:space="0" w:color="9AA5B1"/>
+              <w:top w:val="single" w:color="9AA5B1" w:sz="4" w:space="0"/>
+              <w:left w:val="single" w:color="9AA5B1" w:sz="4" w:space="0"/>
+              <w:bottom w:val="single" w:color="9AA5B1" w:sz="4" w:space="0"/>
+              <w:right w:val="single" w:color="9AA5B1" w:sz="4" w:space="0"/>
             </w:tcBorders>
             <w:tcMar>
               <w:top w:w="40" w:type="dxa"/>
@@ -354,10 +354,10 @@
           <w:tcPr>
             <w:tcW w:w="2400" w:type="dxa"/>
             <w:tcBorders>
-              <w:top w:val="single" w:sz="4" w:space="0" w:color="9AA5B1"/>
-              <w:left w:val="single" w:sz="4" w:space="0" w:color="9AA5B1"/>
-              <w:bottom w:val="single" w:sz="4" w:space="0" w:color="9AA5B1"/>
-              <w:right w:val="single" w:sz="4" w:space="0" w:color="9AA5B1"/>
+              <w:top w:val="single" w:color="9AA5B1" w:sz="4" w:space="0"/>
+              <w:left w:val="single" w:color="9AA5B1" w:sz="4" w:space="0"/>
+              <w:bottom w:val="single" w:color="9AA5B1" w:sz="4" w:space="0"/>
+              <w:right w:val="single" w:color="9AA5B1" w:sz="4" w:space="0"/>
             </w:tcBorders>
             <w:shd w:val="clear" w:color="auto" w:fill="E8EEF7"/>
             <w:tcMar>
@@ -383,10 +383,10 @@
           <w:tcPr>
             <w:tcW w:w="6960" w:type="dxa"/>
             <w:tcBorders>
-              <w:top w:val="single" w:sz="4" w:space="0" w:color="9AA5B1"/>
-              <w:left w:val="single" w:sz="4" w:space="0" w:color="9AA5B1"/>
-              <w:bottom w:val="single" w:sz="4" w:space="0" w:color="9AA5B1"/>
-              <w:right w:val="single" w:sz="4" w:space="0" w:color="9AA5B1"/>
+              <w:top w:val="single" w:color="9AA5B1" w:sz="4" w:space="0"/>
+              <w:left w:val="single" w:color="9AA5B1" w:sz="4" w:space="0"/>
+              <w:bottom w:val="single" w:color="9AA5B1" w:sz="4" w:space="0"/>
+              <w:right w:val="single" w:color="9AA5B1" w:sz="4" w:space="0"/>
             </w:tcBorders>
             <w:tcMar>
               <w:top w:w="40" w:type="dxa"/>
@@ -413,12 +413,12 @@
       <w:tblPr>
         <w:tblW w:w="9360" w:type="dxa"/>
         <w:tblBorders>
-          <w:top w:val="single" w:sz="4" w:space="0" w:color="auto"/>
-          <w:left w:val="single" w:sz="4" w:space="0" w:color="auto"/>
-          <w:bottom w:val="single" w:sz="4" w:space="0" w:color="auto"/>
-          <w:right w:val="single" w:sz="4" w:space="0" w:color="auto"/>
-          <w:insideH w:val="single" w:sz="4" w:space="0" w:color="auto"/>
-          <w:insideV w:val="single" w:sz="4" w:space="0" w:color="auto"/>
+          <w:top w:val="single" w:color="auto" w:sz="4" w:space="0"/>
+          <w:left w:val="single" w:color="auto" w:sz="4" w:space="0"/>
+          <w:bottom w:val="single" w:color="auto" w:sz="4" w:space="0"/>
+          <w:right w:val="single" w:color="auto" w:sz="4" w:space="0"/>
+          <w:insideH w:val="single" w:color="auto" w:sz="4" w:space="0"/>
+          <w:insideV w:val="single" w:color="auto" w:sz="4" w:space="0"/>
         </w:tblBorders>
         <w:tblCellMar>
           <w:left w:w="10" w:type="dxa"/>
@@ -434,10 +434,10 @@
           <w:tcPr>
             <w:tcW w:w="9360" w:type="dxa"/>
             <w:tcBorders>
-              <w:top w:val="none" w:sz="0" w:space="0" w:color="FFFFFF"/>
-              <w:left w:val="none" w:sz="0" w:space="0" w:color="FFFFFF"/>
-              <w:bottom w:val="none" w:sz="0" w:space="0" w:color="FFFFFF"/>
-              <w:right w:val="none" w:sz="0" w:space="0" w:color="FFFFFF"/>
+              <w:top w:val="none" w:color="FFFFFF" w:sz="0" w:space="0"/>
+              <w:left w:val="none" w:color="FFFFFF" w:sz="0" w:space="0"/>
+              <w:bottom w:val="none" w:color="FFFFFF" w:sz="0" w:space="0"/>
+              <w:right w:val="none" w:color="FFFFFF" w:sz="0" w:space="0"/>
             </w:tcBorders>
             <w:shd w:val="clear" w:color="auto" w:fill="0051BA"/>
             <w:tcMar>
@@ -503,12 +503,12 @@
       <w:tblPr>
         <w:tblW w:w="9360" w:type="dxa"/>
         <w:tblBorders>
-          <w:top w:val="single" w:sz="4" w:space="0" w:color="auto"/>
-          <w:left w:val="single" w:sz="4" w:space="0" w:color="auto"/>
-          <w:bottom w:val="single" w:sz="4" w:space="0" w:color="auto"/>
-          <w:right w:val="single" w:sz="4" w:space="0" w:color="auto"/>
-          <w:insideH w:val="single" w:sz="4" w:space="0" w:color="auto"/>
-          <w:insideV w:val="single" w:sz="4" w:space="0" w:color="auto"/>
+          <w:top w:val="single" w:color="auto" w:sz="4" w:space="0"/>
+          <w:left w:val="single" w:color="auto" w:sz="4" w:space="0"/>
+          <w:bottom w:val="single" w:color="auto" w:sz="4" w:space="0"/>
+          <w:right w:val="single" w:color="auto" w:sz="4" w:space="0"/>
+          <w:insideH w:val="single" w:color="auto" w:sz="4" w:space="0"/>
+          <w:insideV w:val="single" w:color="auto" w:sz="4" w:space="0"/>
         </w:tblBorders>
         <w:tblCellMar>
           <w:left w:w="10" w:type="dxa"/>
@@ -531,10 +531,10 @@
           <w:tcPr>
             <w:tcW w:w="520" w:type="dxa"/>
             <w:tcBorders>
-              <w:top w:val="single" w:sz="4" w:space="0" w:color="9AA5B1"/>
-              <w:left w:val="single" w:sz="4" w:space="0" w:color="9AA5B1"/>
-              <w:bottom w:val="single" w:sz="4" w:space="0" w:color="9AA5B1"/>
-              <w:right w:val="single" w:sz="4" w:space="0" w:color="9AA5B1"/>
+              <w:top w:val="single" w:color="9AA5B1" w:sz="4" w:space="0"/>
+              <w:left w:val="single" w:color="9AA5B1" w:sz="4" w:space="0"/>
+              <w:bottom w:val="single" w:color="9AA5B1" w:sz="4" w:space="0"/>
+              <w:right w:val="single" w:color="9AA5B1" w:sz="4" w:space="0"/>
             </w:tcBorders>
             <w:shd w:val="clear" w:color="auto" w:fill="0051BA"/>
             <w:tcMar>
@@ -562,10 +562,10 @@
           <w:tcPr>
             <w:tcW w:w="4040" w:type="dxa"/>
             <w:tcBorders>
-              <w:top w:val="single" w:sz="4" w:space="0" w:color="9AA5B1"/>
-              <w:left w:val="single" w:sz="4" w:space="0" w:color="9AA5B1"/>
-              <w:bottom w:val="single" w:sz="4" w:space="0" w:color="9AA5B1"/>
-              <w:right w:val="single" w:sz="4" w:space="0" w:color="9AA5B1"/>
+              <w:top w:val="single" w:color="9AA5B1" w:sz="4" w:space="0"/>
+              <w:left w:val="single" w:color="9AA5B1" w:sz="4" w:space="0"/>
+              <w:bottom w:val="single" w:color="9AA5B1" w:sz="4" w:space="0"/>
+              <w:right w:val="single" w:color="9AA5B1" w:sz="4" w:space="0"/>
             </w:tcBorders>
             <w:shd w:val="clear" w:color="auto" w:fill="0051BA"/>
             <w:tcMar>
@@ -593,10 +593,10 @@
           <w:tcPr>
             <w:tcW w:w="1400" w:type="dxa"/>
             <w:tcBorders>
-              <w:top w:val="single" w:sz="4" w:space="0" w:color="9AA5B1"/>
-              <w:left w:val="single" w:sz="4" w:space="0" w:color="9AA5B1"/>
-              <w:bottom w:val="single" w:sz="4" w:space="0" w:color="9AA5B1"/>
-              <w:right w:val="single" w:sz="4" w:space="0" w:color="9AA5B1"/>
+              <w:top w:val="single" w:color="9AA5B1" w:sz="4" w:space="0"/>
+              <w:left w:val="single" w:color="9AA5B1" w:sz="4" w:space="0"/>
+              <w:bottom w:val="single" w:color="9AA5B1" w:sz="4" w:space="0"/>
+              <w:right w:val="single" w:color="9AA5B1" w:sz="4" w:space="0"/>
             </w:tcBorders>
             <w:shd w:val="clear" w:color="auto" w:fill="0051BA"/>
             <w:tcMar>
@@ -624,10 +624,10 @@
           <w:tcPr>
             <w:tcW w:w="1400" w:type="dxa"/>
             <w:tcBorders>
-              <w:top w:val="single" w:sz="4" w:space="0" w:color="9AA5B1"/>
-              <w:left w:val="single" w:sz="4" w:space="0" w:color="9AA5B1"/>
-              <w:bottom w:val="single" w:sz="4" w:space="0" w:color="9AA5B1"/>
-              <w:right w:val="single" w:sz="4" w:space="0" w:color="9AA5B1"/>
+              <w:top w:val="single" w:color="9AA5B1" w:sz="4" w:space="0"/>
+              <w:left w:val="single" w:color="9AA5B1" w:sz="4" w:space="0"/>
+              <w:bottom w:val="single" w:color="9AA5B1" w:sz="4" w:space="0"/>
+              <w:right w:val="single" w:color="9AA5B1" w:sz="4" w:space="0"/>
             </w:tcBorders>
             <w:shd w:val="clear" w:color="auto" w:fill="0051BA"/>
             <w:tcMar>
@@ -655,10 +655,10 @@
           <w:tcPr>
             <w:tcW w:w="2000" w:type="dxa"/>
             <w:tcBorders>
-              <w:top w:val="single" w:sz="4" w:space="0" w:color="9AA5B1"/>
-              <w:left w:val="single" w:sz="4" w:space="0" w:color="9AA5B1"/>
-              <w:bottom w:val="single" w:sz="4" w:space="0" w:color="9AA5B1"/>
-              <w:right w:val="single" w:sz="4" w:space="0" w:color="9AA5B1"/>
+              <w:top w:val="single" w:color="9AA5B1" w:sz="4" w:space="0"/>
+              <w:left w:val="single" w:color="9AA5B1" w:sz="4" w:space="0"/>
+              <w:bottom w:val="single" w:color="9AA5B1" w:sz="4" w:space="0"/>
+              <w:right w:val="single" w:color="9AA5B1" w:sz="4" w:space="0"/>
             </w:tcBorders>
             <w:shd w:val="clear" w:color="auto" w:fill="0051BA"/>
             <w:tcMar>
@@ -691,10 +691,10 @@
           <w:tcPr>
             <w:tcW w:w="520" w:type="dxa"/>
             <w:tcBorders>
-              <w:top w:val="single" w:sz="4" w:space="0" w:color="9AA5B1"/>
-              <w:left w:val="single" w:sz="4" w:space="0" w:color="9AA5B1"/>
-              <w:bottom w:val="single" w:sz="4" w:space="0" w:color="9AA5B1"/>
-              <w:right w:val="single" w:sz="4" w:space="0" w:color="9AA5B1"/>
+              <w:top w:val="single" w:color="9AA5B1" w:sz="4" w:space="0"/>
+              <w:left w:val="single" w:color="9AA5B1" w:sz="4" w:space="0"/>
+              <w:bottom w:val="single" w:color="9AA5B1" w:sz="4" w:space="0"/>
+              <w:right w:val="single" w:color="9AA5B1" w:sz="4" w:space="0"/>
             </w:tcBorders>
             <w:shd w:val="clear" w:color="auto" w:fill="F2F2F2" w:themeFill="background1" w:themeFillShade="F2"/>
             <w:tcMar>
@@ -720,10 +720,10 @@
           <w:tcPr>
             <w:tcW w:w="4040" w:type="dxa"/>
             <w:tcBorders>
-              <w:top w:val="single" w:sz="4" w:space="0" w:color="9AA5B1"/>
-              <w:left w:val="single" w:sz="4" w:space="0" w:color="9AA5B1"/>
-              <w:bottom w:val="single" w:sz="4" w:space="0" w:color="9AA5B1"/>
-              <w:right w:val="single" w:sz="4" w:space="0" w:color="9AA5B1"/>
+              <w:top w:val="single" w:color="9AA5B1" w:sz="4" w:space="0"/>
+              <w:left w:val="single" w:color="9AA5B1" w:sz="4" w:space="0"/>
+              <w:bottom w:val="single" w:color="9AA5B1" w:sz="4" w:space="0"/>
+              <w:right w:val="single" w:color="9AA5B1" w:sz="4" w:space="0"/>
             </w:tcBorders>
             <w:tcMar>
               <w:top w:w="60" w:type="dxa"/>
@@ -743,10 +743,10 @@
           <w:tcPr>
             <w:tcW w:w="1400" w:type="dxa"/>
             <w:tcBorders>
-              <w:top w:val="single" w:sz="4" w:space="0" w:color="9AA5B1"/>
-              <w:left w:val="single" w:sz="4" w:space="0" w:color="9AA5B1"/>
-              <w:bottom w:val="single" w:sz="4" w:space="0" w:color="9AA5B1"/>
-              <w:right w:val="single" w:sz="4" w:space="0" w:color="9AA5B1"/>
+              <w:top w:val="single" w:color="9AA5B1" w:sz="4" w:space="0"/>
+              <w:left w:val="single" w:color="9AA5B1" w:sz="4" w:space="0"/>
+              <w:bottom w:val="single" w:color="9AA5B1" w:sz="4" w:space="0"/>
+              <w:right w:val="single" w:color="9AA5B1" w:sz="4" w:space="0"/>
             </w:tcBorders>
             <w:tcMar>
               <w:top w:w="60" w:type="dxa"/>
@@ -766,10 +766,10 @@
           <w:tcPr>
             <w:tcW w:w="1400" w:type="dxa"/>
             <w:tcBorders>
-              <w:top w:val="single" w:sz="4" w:space="0" w:color="9AA5B1"/>
-              <w:left w:val="single" w:sz="4" w:space="0" w:color="9AA5B1"/>
-              <w:bottom w:val="single" w:sz="4" w:space="0" w:color="9AA5B1"/>
-              <w:right w:val="single" w:sz="4" w:space="0" w:color="9AA5B1"/>
+              <w:top w:val="single" w:color="9AA5B1" w:sz="4" w:space="0"/>
+              <w:left w:val="single" w:color="9AA5B1" w:sz="4" w:space="0"/>
+              <w:bottom w:val="single" w:color="9AA5B1" w:sz="4" w:space="0"/>
+              <w:right w:val="single" w:color="9AA5B1" w:sz="4" w:space="0"/>
             </w:tcBorders>
             <w:tcMar>
               <w:top w:w="60" w:type="dxa"/>
@@ -785,10 +785,10 @@
           <w:tcPr>
             <w:tcW w:w="2000" w:type="dxa"/>
             <w:tcBorders>
-              <w:top w:val="single" w:sz="4" w:space="0" w:color="9AA5B1"/>
-              <w:left w:val="single" w:sz="4" w:space="0" w:color="9AA5B1"/>
-              <w:bottom w:val="single" w:sz="4" w:space="0" w:color="9AA5B1"/>
-              <w:right w:val="single" w:sz="4" w:space="0" w:color="9AA5B1"/>
+              <w:top w:val="single" w:color="9AA5B1" w:sz="4" w:space="0"/>
+              <w:left w:val="single" w:color="9AA5B1" w:sz="4" w:space="0"/>
+              <w:bottom w:val="single" w:color="9AA5B1" w:sz="4" w:space="0"/>
+              <w:right w:val="single" w:color="9AA5B1" w:sz="4" w:space="0"/>
             </w:tcBorders>
             <w:tcMar>
               <w:top w:w="60" w:type="dxa"/>
@@ -809,10 +809,10 @@
           <w:tcPr>
             <w:tcW w:w="520" w:type="dxa"/>
             <w:tcBorders>
-              <w:top w:val="single" w:sz="4" w:space="0" w:color="9AA5B1"/>
-              <w:left w:val="single" w:sz="4" w:space="0" w:color="9AA5B1"/>
-              <w:bottom w:val="single" w:sz="4" w:space="0" w:color="9AA5B1"/>
-              <w:right w:val="single" w:sz="4" w:space="0" w:color="9AA5B1"/>
+              <w:top w:val="single" w:color="9AA5B1" w:sz="4" w:space="0"/>
+              <w:left w:val="single" w:color="9AA5B1" w:sz="4" w:space="0"/>
+              <w:bottom w:val="single" w:color="9AA5B1" w:sz="4" w:space="0"/>
+              <w:right w:val="single" w:color="9AA5B1" w:sz="4" w:space="0"/>
             </w:tcBorders>
             <w:shd w:val="clear" w:color="auto" w:fill="F2F2F2" w:themeFill="background1" w:themeFillShade="F2"/>
             <w:tcMar>
@@ -838,10 +838,10 @@
           <w:tcPr>
             <w:tcW w:w="4040" w:type="dxa"/>
             <w:tcBorders>
-              <w:top w:val="single" w:sz="4" w:space="0" w:color="9AA5B1"/>
-              <w:left w:val="single" w:sz="4" w:space="0" w:color="9AA5B1"/>
-              <w:bottom w:val="single" w:sz="4" w:space="0" w:color="9AA5B1"/>
-              <w:right w:val="single" w:sz="4" w:space="0" w:color="9AA5B1"/>
+              <w:top w:val="single" w:color="9AA5B1" w:sz="4" w:space="0"/>
+              <w:left w:val="single" w:color="9AA5B1" w:sz="4" w:space="0"/>
+              <w:bottom w:val="single" w:color="9AA5B1" w:sz="4" w:space="0"/>
+              <w:right w:val="single" w:color="9AA5B1" w:sz="4" w:space="0"/>
             </w:tcBorders>
             <w:tcMar>
               <w:top w:w="60" w:type="dxa"/>
@@ -861,10 +861,10 @@
           <w:tcPr>
             <w:tcW w:w="1400" w:type="dxa"/>
             <w:tcBorders>
-              <w:top w:val="single" w:sz="4" w:space="0" w:color="9AA5B1"/>
-              <w:left w:val="single" w:sz="4" w:space="0" w:color="9AA5B1"/>
-              <w:bottom w:val="single" w:sz="4" w:space="0" w:color="9AA5B1"/>
-              <w:right w:val="single" w:sz="4" w:space="0" w:color="9AA5B1"/>
+              <w:top w:val="single" w:color="9AA5B1" w:sz="4" w:space="0"/>
+              <w:left w:val="single" w:color="9AA5B1" w:sz="4" w:space="0"/>
+              <w:bottom w:val="single" w:color="9AA5B1" w:sz="4" w:space="0"/>
+              <w:right w:val="single" w:color="9AA5B1" w:sz="4" w:space="0"/>
             </w:tcBorders>
             <w:tcMar>
               <w:top w:w="60" w:type="dxa"/>
@@ -884,10 +884,10 @@
           <w:tcPr>
             <w:tcW w:w="1400" w:type="dxa"/>
             <w:tcBorders>
-              <w:top w:val="single" w:sz="4" w:space="0" w:color="9AA5B1"/>
-              <w:left w:val="single" w:sz="4" w:space="0" w:color="9AA5B1"/>
-              <w:bottom w:val="single" w:sz="4" w:space="0" w:color="9AA5B1"/>
-              <w:right w:val="single" w:sz="4" w:space="0" w:color="9AA5B1"/>
+              <w:top w:val="single" w:color="9AA5B1" w:sz="4" w:space="0"/>
+              <w:left w:val="single" w:color="9AA5B1" w:sz="4" w:space="0"/>
+              <w:bottom w:val="single" w:color="9AA5B1" w:sz="4" w:space="0"/>
+              <w:right w:val="single" w:color="9AA5B1" w:sz="4" w:space="0"/>
             </w:tcBorders>
             <w:tcMar>
               <w:top w:w="60" w:type="dxa"/>
@@ -903,10 +903,10 @@
           <w:tcPr>
             <w:tcW w:w="2000" w:type="dxa"/>
             <w:tcBorders>
-              <w:top w:val="single" w:sz="4" w:space="0" w:color="9AA5B1"/>
-              <w:left w:val="single" w:sz="4" w:space="0" w:color="9AA5B1"/>
-              <w:bottom w:val="single" w:sz="4" w:space="0" w:color="9AA5B1"/>
-              <w:right w:val="single" w:sz="4" w:space="0" w:color="9AA5B1"/>
+              <w:top w:val="single" w:color="9AA5B1" w:sz="4" w:space="0"/>
+              <w:left w:val="single" w:color="9AA5B1" w:sz="4" w:space="0"/>
+              <w:bottom w:val="single" w:color="9AA5B1" w:sz="4" w:space="0"/>
+              <w:right w:val="single" w:color="9AA5B1" w:sz="4" w:space="0"/>
             </w:tcBorders>
             <w:tcMar>
               <w:top w:w="60" w:type="dxa"/>
@@ -927,10 +927,10 @@
           <w:tcPr>
             <w:tcW w:w="520" w:type="dxa"/>
             <w:tcBorders>
-              <w:top w:val="single" w:sz="4" w:space="0" w:color="9AA5B1"/>
-              <w:left w:val="single" w:sz="4" w:space="0" w:color="9AA5B1"/>
-              <w:bottom w:val="single" w:sz="4" w:space="0" w:color="9AA5B1"/>
-              <w:right w:val="single" w:sz="4" w:space="0" w:color="9AA5B1"/>
+              <w:top w:val="single" w:color="9AA5B1" w:sz="4" w:space="0"/>
+              <w:left w:val="single" w:color="9AA5B1" w:sz="4" w:space="0"/>
+              <w:bottom w:val="single" w:color="9AA5B1" w:sz="4" w:space="0"/>
+              <w:right w:val="single" w:color="9AA5B1" w:sz="4" w:space="0"/>
             </w:tcBorders>
             <w:shd w:val="clear" w:color="auto" w:fill="F2F2F2" w:themeFill="background1" w:themeFillShade="F2"/>
             <w:tcMar>
@@ -956,10 +956,10 @@
           <w:tcPr>
             <w:tcW w:w="4040" w:type="dxa"/>
             <w:tcBorders>
-              <w:top w:val="single" w:sz="4" w:space="0" w:color="9AA5B1"/>
-              <w:left w:val="single" w:sz="4" w:space="0" w:color="9AA5B1"/>
-              <w:bottom w:val="single" w:sz="4" w:space="0" w:color="9AA5B1"/>
-              <w:right w:val="single" w:sz="4" w:space="0" w:color="9AA5B1"/>
+              <w:top w:val="single" w:color="9AA5B1" w:sz="4" w:space="0"/>
+              <w:left w:val="single" w:color="9AA5B1" w:sz="4" w:space="0"/>
+              <w:bottom w:val="single" w:color="9AA5B1" w:sz="4" w:space="0"/>
+              <w:right w:val="single" w:color="9AA5B1" w:sz="4" w:space="0"/>
             </w:tcBorders>
             <w:tcMar>
               <w:top w:w="60" w:type="dxa"/>
@@ -979,10 +979,10 @@
           <w:tcPr>
             <w:tcW w:w="1400" w:type="dxa"/>
             <w:tcBorders>
-              <w:top w:val="single" w:sz="4" w:space="0" w:color="9AA5B1"/>
-              <w:left w:val="single" w:sz="4" w:space="0" w:color="9AA5B1"/>
-              <w:bottom w:val="single" w:sz="4" w:space="0" w:color="9AA5B1"/>
-              <w:right w:val="single" w:sz="4" w:space="0" w:color="9AA5B1"/>
+              <w:top w:val="single" w:color="9AA5B1" w:sz="4" w:space="0"/>
+              <w:left w:val="single" w:color="9AA5B1" w:sz="4" w:space="0"/>
+              <w:bottom w:val="single" w:color="9AA5B1" w:sz="4" w:space="0"/>
+              <w:right w:val="single" w:color="9AA5B1" w:sz="4" w:space="0"/>
             </w:tcBorders>
             <w:tcMar>
               <w:top w:w="60" w:type="dxa"/>
@@ -1002,10 +1002,10 @@
           <w:tcPr>
             <w:tcW w:w="1400" w:type="dxa"/>
             <w:tcBorders>
-              <w:top w:val="single" w:sz="4" w:space="0" w:color="9AA5B1"/>
-              <w:left w:val="single" w:sz="4" w:space="0" w:color="9AA5B1"/>
-              <w:bottom w:val="single" w:sz="4" w:space="0" w:color="9AA5B1"/>
-              <w:right w:val="single" w:sz="4" w:space="0" w:color="9AA5B1"/>
+              <w:top w:val="single" w:color="9AA5B1" w:sz="4" w:space="0"/>
+              <w:left w:val="single" w:color="9AA5B1" w:sz="4" w:space="0"/>
+              <w:bottom w:val="single" w:color="9AA5B1" w:sz="4" w:space="0"/>
+              <w:right w:val="single" w:color="9AA5B1" w:sz="4" w:space="0"/>
             </w:tcBorders>
             <w:tcMar>
               <w:top w:w="60" w:type="dxa"/>
@@ -1021,10 +1021,10 @@
           <w:tcPr>
             <w:tcW w:w="2000" w:type="dxa"/>
             <w:tcBorders>
-              <w:top w:val="single" w:sz="4" w:space="0" w:color="9AA5B1"/>
-              <w:left w:val="single" w:sz="4" w:space="0" w:color="9AA5B1"/>
-              <w:bottom w:val="single" w:sz="4" w:space="0" w:color="9AA5B1"/>
-              <w:right w:val="single" w:sz="4" w:space="0" w:color="9AA5B1"/>
+              <w:top w:val="single" w:color="9AA5B1" w:sz="4" w:space="0"/>
+              <w:left w:val="single" w:color="9AA5B1" w:sz="4" w:space="0"/>
+              <w:bottom w:val="single" w:color="9AA5B1" w:sz="4" w:space="0"/>
+              <w:right w:val="single" w:color="9AA5B1" w:sz="4" w:space="0"/>
             </w:tcBorders>
             <w:tcMar>
               <w:top w:w="60" w:type="dxa"/>
@@ -1045,10 +1045,10 @@
           <w:tcPr>
             <w:tcW w:w="520" w:type="dxa"/>
             <w:tcBorders>
-              <w:top w:val="single" w:sz="4" w:space="0" w:color="9AA5B1"/>
-              <w:left w:val="single" w:sz="4" w:space="0" w:color="9AA5B1"/>
-              <w:bottom w:val="single" w:sz="4" w:space="0" w:color="9AA5B1"/>
-              <w:right w:val="single" w:sz="4" w:space="0" w:color="9AA5B1"/>
+              <w:top w:val="single" w:color="9AA5B1" w:sz="4" w:space="0"/>
+              <w:left w:val="single" w:color="9AA5B1" w:sz="4" w:space="0"/>
+              <w:bottom w:val="single" w:color="9AA5B1" w:sz="4" w:space="0"/>
+              <w:right w:val="single" w:color="9AA5B1" w:sz="4" w:space="0"/>
             </w:tcBorders>
             <w:shd w:val="clear" w:color="auto" w:fill="F2F2F2" w:themeFill="background1" w:themeFillShade="F2"/>
             <w:tcMar>
@@ -1074,10 +1074,10 @@
           <w:tcPr>
             <w:tcW w:w="4040" w:type="dxa"/>
             <w:tcBorders>
-              <w:top w:val="single" w:sz="4" w:space="0" w:color="9AA5B1"/>
-              <w:left w:val="single" w:sz="4" w:space="0" w:color="9AA5B1"/>
-              <w:bottom w:val="single" w:sz="4" w:space="0" w:color="9AA5B1"/>
-              <w:right w:val="single" w:sz="4" w:space="0" w:color="9AA5B1"/>
+              <w:top w:val="single" w:color="9AA5B1" w:sz="4" w:space="0"/>
+              <w:left w:val="single" w:color="9AA5B1" w:sz="4" w:space="0"/>
+              <w:bottom w:val="single" w:color="9AA5B1" w:sz="4" w:space="0"/>
+              <w:right w:val="single" w:color="9AA5B1" w:sz="4" w:space="0"/>
             </w:tcBorders>
             <w:tcMar>
               <w:top w:w="60" w:type="dxa"/>
@@ -1097,10 +1097,10 @@
           <w:tcPr>
             <w:tcW w:w="1400" w:type="dxa"/>
             <w:tcBorders>
-              <w:top w:val="single" w:sz="4" w:space="0" w:color="9AA5B1"/>
-              <w:left w:val="single" w:sz="4" w:space="0" w:color="9AA5B1"/>
-              <w:bottom w:val="single" w:sz="4" w:space="0" w:color="9AA5B1"/>
-              <w:right w:val="single" w:sz="4" w:space="0" w:color="9AA5B1"/>
+              <w:top w:val="single" w:color="9AA5B1" w:sz="4" w:space="0"/>
+              <w:left w:val="single" w:color="9AA5B1" w:sz="4" w:space="0"/>
+              <w:bottom w:val="single" w:color="9AA5B1" w:sz="4" w:space="0"/>
+              <w:right w:val="single" w:color="9AA5B1" w:sz="4" w:space="0"/>
             </w:tcBorders>
             <w:tcMar>
               <w:top w:w="60" w:type="dxa"/>
@@ -1120,10 +1120,10 @@
           <w:tcPr>
             <w:tcW w:w="1400" w:type="dxa"/>
             <w:tcBorders>
-              <w:top w:val="single" w:sz="4" w:space="0" w:color="9AA5B1"/>
-              <w:left w:val="single" w:sz="4" w:space="0" w:color="9AA5B1"/>
-              <w:bottom w:val="single" w:sz="4" w:space="0" w:color="9AA5B1"/>
-              <w:right w:val="single" w:sz="4" w:space="0" w:color="9AA5B1"/>
+              <w:top w:val="single" w:color="9AA5B1" w:sz="4" w:space="0"/>
+              <w:left w:val="single" w:color="9AA5B1" w:sz="4" w:space="0"/>
+              <w:bottom w:val="single" w:color="9AA5B1" w:sz="4" w:space="0"/>
+              <w:right w:val="single" w:color="9AA5B1" w:sz="4" w:space="0"/>
             </w:tcBorders>
             <w:tcMar>
               <w:top w:w="60" w:type="dxa"/>
@@ -1139,10 +1139,10 @@
           <w:tcPr>
             <w:tcW w:w="2000" w:type="dxa"/>
             <w:tcBorders>
-              <w:top w:val="single" w:sz="4" w:space="0" w:color="9AA5B1"/>
-              <w:left w:val="single" w:sz="4" w:space="0" w:color="9AA5B1"/>
-              <w:bottom w:val="single" w:sz="4" w:space="0" w:color="9AA5B1"/>
-              <w:right w:val="single" w:sz="4" w:space="0" w:color="9AA5B1"/>
+              <w:top w:val="single" w:color="9AA5B1" w:sz="4" w:space="0"/>
+              <w:left w:val="single" w:color="9AA5B1" w:sz="4" w:space="0"/>
+              <w:bottom w:val="single" w:color="9AA5B1" w:sz="4" w:space="0"/>
+              <w:right w:val="single" w:color="9AA5B1" w:sz="4" w:space="0"/>
             </w:tcBorders>
             <w:tcMar>
               <w:top w:w="60" w:type="dxa"/>
@@ -1163,10 +1163,10 @@
           <w:tcPr>
             <w:tcW w:w="520" w:type="dxa"/>
             <w:tcBorders>
-              <w:top w:val="single" w:sz="4" w:space="0" w:color="9AA5B1"/>
-              <w:left w:val="single" w:sz="4" w:space="0" w:color="9AA5B1"/>
-              <w:bottom w:val="single" w:sz="4" w:space="0" w:color="9AA5B1"/>
-              <w:right w:val="single" w:sz="4" w:space="0" w:color="9AA5B1"/>
+              <w:top w:val="single" w:color="9AA5B1" w:sz="4" w:space="0"/>
+              <w:left w:val="single" w:color="9AA5B1" w:sz="4" w:space="0"/>
+              <w:bottom w:val="single" w:color="9AA5B1" w:sz="4" w:space="0"/>
+              <w:right w:val="single" w:color="9AA5B1" w:sz="4" w:space="0"/>
             </w:tcBorders>
             <w:shd w:val="clear" w:color="auto" w:fill="F2F2F2" w:themeFill="background1" w:themeFillShade="F2"/>
             <w:tcMar>
@@ -1192,10 +1192,10 @@
           <w:tcPr>
             <w:tcW w:w="4040" w:type="dxa"/>
             <w:tcBorders>
-              <w:top w:val="single" w:sz="4" w:space="0" w:color="9AA5B1"/>
-              <w:left w:val="single" w:sz="4" w:space="0" w:color="9AA5B1"/>
-              <w:bottom w:val="single" w:sz="4" w:space="0" w:color="9AA5B1"/>
-              <w:right w:val="single" w:sz="4" w:space="0" w:color="9AA5B1"/>
+              <w:top w:val="single" w:color="9AA5B1" w:sz="4" w:space="0"/>
+              <w:left w:val="single" w:color="9AA5B1" w:sz="4" w:space="0"/>
+              <w:bottom w:val="single" w:color="9AA5B1" w:sz="4" w:space="0"/>
+              <w:right w:val="single" w:color="9AA5B1" w:sz="4" w:space="0"/>
             </w:tcBorders>
             <w:tcMar>
               <w:top w:w="60" w:type="dxa"/>
@@ -1215,10 +1215,10 @@
           <w:tcPr>
             <w:tcW w:w="1400" w:type="dxa"/>
             <w:tcBorders>
-              <w:top w:val="single" w:sz="4" w:space="0" w:color="9AA5B1"/>
-              <w:left w:val="single" w:sz="4" w:space="0" w:color="9AA5B1"/>
-              <w:bottom w:val="single" w:sz="4" w:space="0" w:color="9AA5B1"/>
-              <w:right w:val="single" w:sz="4" w:space="0" w:color="9AA5B1"/>
+              <w:top w:val="single" w:color="9AA5B1" w:sz="4" w:space="0"/>
+              <w:left w:val="single" w:color="9AA5B1" w:sz="4" w:space="0"/>
+              <w:bottom w:val="single" w:color="9AA5B1" w:sz="4" w:space="0"/>
+              <w:right w:val="single" w:color="9AA5B1" w:sz="4" w:space="0"/>
             </w:tcBorders>
             <w:tcMar>
               <w:top w:w="60" w:type="dxa"/>
@@ -1238,10 +1238,10 @@
           <w:tcPr>
             <w:tcW w:w="1400" w:type="dxa"/>
             <w:tcBorders>
-              <w:top w:val="single" w:sz="4" w:space="0" w:color="9AA5B1"/>
-              <w:left w:val="single" w:sz="4" w:space="0" w:color="9AA5B1"/>
-              <w:bottom w:val="single" w:sz="4" w:space="0" w:color="9AA5B1"/>
-              <w:right w:val="single" w:sz="4" w:space="0" w:color="9AA5B1"/>
+              <w:top w:val="single" w:color="9AA5B1" w:sz="4" w:space="0"/>
+              <w:left w:val="single" w:color="9AA5B1" w:sz="4" w:space="0"/>
+              <w:bottom w:val="single" w:color="9AA5B1" w:sz="4" w:space="0"/>
+              <w:right w:val="single" w:color="9AA5B1" w:sz="4" w:space="0"/>
             </w:tcBorders>
             <w:tcMar>
               <w:top w:w="60" w:type="dxa"/>
@@ -1257,10 +1257,10 @@
           <w:tcPr>
             <w:tcW w:w="2000" w:type="dxa"/>
             <w:tcBorders>
-              <w:top w:val="single" w:sz="4" w:space="0" w:color="9AA5B1"/>
-              <w:left w:val="single" w:sz="4" w:space="0" w:color="9AA5B1"/>
-              <w:bottom w:val="single" w:sz="4" w:space="0" w:color="9AA5B1"/>
-              <w:right w:val="single" w:sz="4" w:space="0" w:color="9AA5B1"/>
+              <w:top w:val="single" w:color="9AA5B1" w:sz="4" w:space="0"/>
+              <w:left w:val="single" w:color="9AA5B1" w:sz="4" w:space="0"/>
+              <w:bottom w:val="single" w:color="9AA5B1" w:sz="4" w:space="0"/>
+              <w:right w:val="single" w:color="9AA5B1" w:sz="4" w:space="0"/>
             </w:tcBorders>
             <w:tcMar>
               <w:top w:w="60" w:type="dxa"/>
@@ -1281,10 +1281,10 @@
           <w:tcPr>
             <w:tcW w:w="520" w:type="dxa"/>
             <w:tcBorders>
-              <w:top w:val="single" w:sz="4" w:space="0" w:color="9AA5B1"/>
-              <w:left w:val="single" w:sz="4" w:space="0" w:color="9AA5B1"/>
-              <w:bottom w:val="single" w:sz="4" w:space="0" w:color="9AA5B1"/>
-              <w:right w:val="single" w:sz="4" w:space="0" w:color="9AA5B1"/>
+              <w:top w:val="single" w:color="9AA5B1" w:sz="4" w:space="0"/>
+              <w:left w:val="single" w:color="9AA5B1" w:sz="4" w:space="0"/>
+              <w:bottom w:val="single" w:color="9AA5B1" w:sz="4" w:space="0"/>
+              <w:right w:val="single" w:color="9AA5B1" w:sz="4" w:space="0"/>
             </w:tcBorders>
             <w:shd w:val="clear" w:color="auto" w:fill="F2F2F2" w:themeFill="background1" w:themeFillShade="F2"/>
             <w:tcMar>
@@ -1310,10 +1310,10 @@
           <w:tcPr>
             <w:tcW w:w="4040" w:type="dxa"/>
             <w:tcBorders>
-              <w:top w:val="single" w:sz="4" w:space="0" w:color="9AA5B1"/>
-              <w:left w:val="single" w:sz="4" w:space="0" w:color="9AA5B1"/>
-              <w:bottom w:val="single" w:sz="4" w:space="0" w:color="9AA5B1"/>
-              <w:right w:val="single" w:sz="4" w:space="0" w:color="9AA5B1"/>
+              <w:top w:val="single" w:color="9AA5B1" w:sz="4" w:space="0"/>
+              <w:left w:val="single" w:color="9AA5B1" w:sz="4" w:space="0"/>
+              <w:bottom w:val="single" w:color="9AA5B1" w:sz="4" w:space="0"/>
+              <w:right w:val="single" w:color="9AA5B1" w:sz="4" w:space="0"/>
             </w:tcBorders>
             <w:tcMar>
               <w:top w:w="60" w:type="dxa"/>
@@ -1333,10 +1333,10 @@
           <w:tcPr>
             <w:tcW w:w="1400" w:type="dxa"/>
             <w:tcBorders>
-              <w:top w:val="single" w:sz="4" w:space="0" w:color="9AA5B1"/>
-              <w:left w:val="single" w:sz="4" w:space="0" w:color="9AA5B1"/>
-              <w:bottom w:val="single" w:sz="4" w:space="0" w:color="9AA5B1"/>
-              <w:right w:val="single" w:sz="4" w:space="0" w:color="9AA5B1"/>
+              <w:top w:val="single" w:color="9AA5B1" w:sz="4" w:space="0"/>
+              <w:left w:val="single" w:color="9AA5B1" w:sz="4" w:space="0"/>
+              <w:bottom w:val="single" w:color="9AA5B1" w:sz="4" w:space="0"/>
+              <w:right w:val="single" w:color="9AA5B1" w:sz="4" w:space="0"/>
             </w:tcBorders>
             <w:tcMar>
               <w:top w:w="60" w:type="dxa"/>
@@ -1356,10 +1356,10 @@
           <w:tcPr>
             <w:tcW w:w="1400" w:type="dxa"/>
             <w:tcBorders>
-              <w:top w:val="single" w:sz="4" w:space="0" w:color="9AA5B1"/>
-              <w:left w:val="single" w:sz="4" w:space="0" w:color="9AA5B1"/>
-              <w:bottom w:val="single" w:sz="4" w:space="0" w:color="9AA5B1"/>
-              <w:right w:val="single" w:sz="4" w:space="0" w:color="9AA5B1"/>
+              <w:top w:val="single" w:color="9AA5B1" w:sz="4" w:space="0"/>
+              <w:left w:val="single" w:color="9AA5B1" w:sz="4" w:space="0"/>
+              <w:bottom w:val="single" w:color="9AA5B1" w:sz="4" w:space="0"/>
+              <w:right w:val="single" w:color="9AA5B1" w:sz="4" w:space="0"/>
             </w:tcBorders>
             <w:tcMar>
               <w:top w:w="60" w:type="dxa"/>
@@ -1375,10 +1375,10 @@
           <w:tcPr>
             <w:tcW w:w="2000" w:type="dxa"/>
             <w:tcBorders>
-              <w:top w:val="single" w:sz="4" w:space="0" w:color="9AA5B1"/>
-              <w:left w:val="single" w:sz="4" w:space="0" w:color="9AA5B1"/>
-              <w:bottom w:val="single" w:sz="4" w:space="0" w:color="9AA5B1"/>
-              <w:right w:val="single" w:sz="4" w:space="0" w:color="9AA5B1"/>
+              <w:top w:val="single" w:color="9AA5B1" w:sz="4" w:space="0"/>
+              <w:left w:val="single" w:color="9AA5B1" w:sz="4" w:space="0"/>
+              <w:bottom w:val="single" w:color="9AA5B1" w:sz="4" w:space="0"/>
+              <w:right w:val="single" w:color="9AA5B1" w:sz="4" w:space="0"/>
             </w:tcBorders>
             <w:tcMar>
               <w:top w:w="60" w:type="dxa"/>
@@ -1401,12 +1401,12 @@
       <w:tblPr>
         <w:tblW w:w="9360" w:type="dxa"/>
         <w:tblBorders>
-          <w:top w:val="single" w:sz="4" w:space="0" w:color="auto"/>
-          <w:left w:val="single" w:sz="4" w:space="0" w:color="auto"/>
-          <w:bottom w:val="single" w:sz="4" w:space="0" w:color="auto"/>
-          <w:right w:val="single" w:sz="4" w:space="0" w:color="auto"/>
-          <w:insideH w:val="single" w:sz="4" w:space="0" w:color="auto"/>
-          <w:insideV w:val="single" w:sz="4" w:space="0" w:color="auto"/>
+          <w:top w:val="single" w:color="auto" w:sz="4" w:space="0"/>
+          <w:left w:val="single" w:color="auto" w:sz="4" w:space="0"/>
+          <w:bottom w:val="single" w:color="auto" w:sz="4" w:space="0"/>
+          <w:right w:val="single" w:color="auto" w:sz="4" w:space="0"/>
+          <w:insideH w:val="single" w:color="auto" w:sz="4" w:space="0"/>
+          <w:insideV w:val="single" w:color="auto" w:sz="4" w:space="0"/>
         </w:tblBorders>
         <w:tblCellMar>
           <w:left w:w="10" w:type="dxa"/>
@@ -1422,10 +1422,10 @@
           <w:tcPr>
             <w:tcW w:w="9360" w:type="dxa"/>
             <w:tcBorders>
-              <w:top w:val="none" w:sz="0" w:space="0" w:color="FFFFFF"/>
-              <w:left w:val="none" w:sz="0" w:space="0" w:color="FFFFFF"/>
-              <w:bottom w:val="none" w:sz="0" w:space="0" w:color="FFFFFF"/>
-              <w:right w:val="none" w:sz="0" w:space="0" w:color="FFFFFF"/>
+              <w:top w:val="none" w:color="FFFFFF" w:sz="0" w:space="0"/>
+              <w:left w:val="none" w:color="FFFFFF" w:sz="0" w:space="0"/>
+              <w:bottom w:val="none" w:color="FFFFFF" w:sz="0" w:space="0"/>
+              <w:right w:val="none" w:color="FFFFFF" w:sz="0" w:space="0"/>
             </w:tcBorders>
             <w:shd w:val="clear" w:color="auto" w:fill="0051BA"/>
             <w:tcMar>
@@ -1469,12 +1469,12 @@
       <w:tblPr>
         <w:tblW w:w="9360" w:type="dxa"/>
         <w:tblBorders>
-          <w:top w:val="single" w:sz="4" w:space="0" w:color="auto"/>
-          <w:left w:val="single" w:sz="4" w:space="0" w:color="auto"/>
-          <w:bottom w:val="single" w:sz="4" w:space="0" w:color="auto"/>
-          <w:right w:val="single" w:sz="4" w:space="0" w:color="auto"/>
-          <w:insideH w:val="single" w:sz="4" w:space="0" w:color="auto"/>
-          <w:insideV w:val="single" w:sz="4" w:space="0" w:color="auto"/>
+          <w:top w:val="single" w:color="auto" w:sz="4" w:space="0"/>
+          <w:left w:val="single" w:color="auto" w:sz="4" w:space="0"/>
+          <w:bottom w:val="single" w:color="auto" w:sz="4" w:space="0"/>
+          <w:right w:val="single" w:color="auto" w:sz="4" w:space="0"/>
+          <w:insideH w:val="single" w:color="auto" w:sz="4" w:space="0"/>
+          <w:insideV w:val="single" w:color="auto" w:sz="4" w:space="0"/>
         </w:tblBorders>
         <w:tblCellMar>
           <w:left w:w="10" w:type="dxa"/>
@@ -1495,10 +1495,10 @@
           <w:tcPr>
             <w:tcW w:w="2340" w:type="dxa"/>
             <w:tcBorders>
-              <w:top w:val="single" w:sz="4" w:space="0" w:color="9AA5B1"/>
-              <w:left w:val="single" w:sz="4" w:space="0" w:color="9AA5B1"/>
-              <w:bottom w:val="single" w:sz="4" w:space="0" w:color="9AA5B1"/>
-              <w:right w:val="single" w:sz="4" w:space="0" w:color="9AA5B1"/>
+              <w:top w:val="single" w:color="9AA5B1" w:sz="4" w:space="0"/>
+              <w:left w:val="single" w:color="9AA5B1" w:sz="4" w:space="0"/>
+              <w:bottom w:val="single" w:color="9AA5B1" w:sz="4" w:space="0"/>
+              <w:right w:val="single" w:color="9AA5B1" w:sz="4" w:space="0"/>
             </w:tcBorders>
             <w:shd w:val="clear" w:color="auto" w:fill="0051BA"/>
             <w:tcMar>
@@ -1526,10 +1526,10 @@
           <w:tcPr>
             <w:tcW w:w="4680" w:type="dxa"/>
             <w:tcBorders>
-              <w:top w:val="single" w:sz="4" w:space="0" w:color="9AA5B1"/>
-              <w:left w:val="single" w:sz="4" w:space="0" w:color="9AA5B1"/>
-              <w:bottom w:val="single" w:sz="4" w:space="0" w:color="9AA5B1"/>
-              <w:right w:val="single" w:sz="4" w:space="0" w:color="9AA5B1"/>
+              <w:top w:val="single" w:color="9AA5B1" w:sz="4" w:space="0"/>
+              <w:left w:val="single" w:color="9AA5B1" w:sz="4" w:space="0"/>
+              <w:bottom w:val="single" w:color="9AA5B1" w:sz="4" w:space="0"/>
+              <w:right w:val="single" w:color="9AA5B1" w:sz="4" w:space="0"/>
             </w:tcBorders>
             <w:shd w:val="clear" w:color="auto" w:fill="0051BA"/>
             <w:tcMar>
@@ -1557,10 +1557,10 @@
           <w:tcPr>
             <w:tcW w:w="2340" w:type="dxa"/>
             <w:tcBorders>
-              <w:top w:val="single" w:sz="4" w:space="0" w:color="9AA5B1"/>
-              <w:left w:val="single" w:sz="4" w:space="0" w:color="9AA5B1"/>
-              <w:bottom w:val="single" w:sz="4" w:space="0" w:color="9AA5B1"/>
-              <w:right w:val="single" w:sz="4" w:space="0" w:color="9AA5B1"/>
+              <w:top w:val="single" w:color="9AA5B1" w:sz="4" w:space="0"/>
+              <w:left w:val="single" w:color="9AA5B1" w:sz="4" w:space="0"/>
+              <w:bottom w:val="single" w:color="9AA5B1" w:sz="4" w:space="0"/>
+              <w:right w:val="single" w:color="9AA5B1" w:sz="4" w:space="0"/>
             </w:tcBorders>
             <w:shd w:val="clear" w:color="auto" w:fill="0051BA"/>
             <w:tcMar>
@@ -1593,10 +1593,10 @@
           <w:tcPr>
             <w:tcW w:w="2340" w:type="dxa"/>
             <w:tcBorders>
-              <w:top w:val="single" w:sz="4" w:space="0" w:color="9AA5B1"/>
-              <w:left w:val="single" w:sz="4" w:space="0" w:color="9AA5B1"/>
-              <w:bottom w:val="single" w:sz="4" w:space="0" w:color="9AA5B1"/>
-              <w:right w:val="single" w:sz="4" w:space="0" w:color="9AA5B1"/>
+              <w:top w:val="single" w:color="9AA5B1" w:sz="4" w:space="0"/>
+              <w:left w:val="single" w:color="9AA5B1" w:sz="4" w:space="0"/>
+              <w:bottom w:val="single" w:color="9AA5B1" w:sz="4" w:space="0"/>
+              <w:right w:val="single" w:color="9AA5B1" w:sz="4" w:space="0"/>
             </w:tcBorders>
             <w:tcMar>
               <w:top w:w="60" w:type="dxa"/>
@@ -1612,10 +1612,10 @@
           <w:tcPr>
             <w:tcW w:w="4680" w:type="dxa"/>
             <w:tcBorders>
-              <w:top w:val="single" w:sz="4" w:space="0" w:color="9AA5B1"/>
-              <w:left w:val="single" w:sz="4" w:space="0" w:color="9AA5B1"/>
-              <w:bottom w:val="single" w:sz="4" w:space="0" w:color="9AA5B1"/>
-              <w:right w:val="single" w:sz="4" w:space="0" w:color="9AA5B1"/>
+              <w:top w:val="single" w:color="9AA5B1" w:sz="4" w:space="0"/>
+              <w:left w:val="single" w:color="9AA5B1" w:sz="4" w:space="0"/>
+              <w:bottom w:val="single" w:color="9AA5B1" w:sz="4" w:space="0"/>
+              <w:right w:val="single" w:color="9AA5B1" w:sz="4" w:space="0"/>
             </w:tcBorders>
             <w:tcMar>
               <w:top w:w="60" w:type="dxa"/>
@@ -1631,10 +1631,10 @@
           <w:tcPr>
             <w:tcW w:w="2340" w:type="dxa"/>
             <w:tcBorders>
-              <w:top w:val="single" w:sz="4" w:space="0" w:color="9AA5B1"/>
-              <w:left w:val="single" w:sz="4" w:space="0" w:color="9AA5B1"/>
-              <w:bottom w:val="single" w:sz="4" w:space="0" w:color="9AA5B1"/>
-              <w:right w:val="single" w:sz="4" w:space="0" w:color="9AA5B1"/>
+              <w:top w:val="single" w:color="9AA5B1" w:sz="4" w:space="0"/>
+              <w:left w:val="single" w:color="9AA5B1" w:sz="4" w:space="0"/>
+              <w:bottom w:val="single" w:color="9AA5B1" w:sz="4" w:space="0"/>
+              <w:right w:val="single" w:color="9AA5B1" w:sz="4" w:space="0"/>
             </w:tcBorders>
             <w:tcMar>
               <w:top w:w="60" w:type="dxa"/>
@@ -1655,10 +1655,10 @@
           <w:tcPr>
             <w:tcW w:w="2340" w:type="dxa"/>
             <w:tcBorders>
-              <w:top w:val="single" w:sz="4" w:space="0" w:color="9AA5B1"/>
-              <w:left w:val="single" w:sz="4" w:space="0" w:color="9AA5B1"/>
-              <w:bottom w:val="single" w:sz="4" w:space="0" w:color="9AA5B1"/>
-              <w:right w:val="single" w:sz="4" w:space="0" w:color="9AA5B1"/>
+              <w:top w:val="single" w:color="9AA5B1" w:sz="4" w:space="0"/>
+              <w:left w:val="single" w:color="9AA5B1" w:sz="4" w:space="0"/>
+              <w:bottom w:val="single" w:color="9AA5B1" w:sz="4" w:space="0"/>
+              <w:right w:val="single" w:color="9AA5B1" w:sz="4" w:space="0"/>
             </w:tcBorders>
             <w:tcMar>
               <w:top w:w="60" w:type="dxa"/>
@@ -1674,10 +1674,10 @@
           <w:tcPr>
             <w:tcW w:w="4680" w:type="dxa"/>
             <w:tcBorders>
-              <w:top w:val="single" w:sz="4" w:space="0" w:color="9AA5B1"/>
-              <w:left w:val="single" w:sz="4" w:space="0" w:color="9AA5B1"/>
-              <w:bottom w:val="single" w:sz="4" w:space="0" w:color="9AA5B1"/>
-              <w:right w:val="single" w:sz="4" w:space="0" w:color="9AA5B1"/>
+              <w:top w:val="single" w:color="9AA5B1" w:sz="4" w:space="0"/>
+              <w:left w:val="single" w:color="9AA5B1" w:sz="4" w:space="0"/>
+              <w:bottom w:val="single" w:color="9AA5B1" w:sz="4" w:space="0"/>
+              <w:right w:val="single" w:color="9AA5B1" w:sz="4" w:space="0"/>
             </w:tcBorders>
             <w:tcMar>
               <w:top w:w="60" w:type="dxa"/>
@@ -1693,10 +1693,10 @@
           <w:tcPr>
             <w:tcW w:w="2340" w:type="dxa"/>
             <w:tcBorders>
-              <w:top w:val="single" w:sz="4" w:space="0" w:color="9AA5B1"/>
-              <w:left w:val="single" w:sz="4" w:space="0" w:color="9AA5B1"/>
-              <w:bottom w:val="single" w:sz="4" w:space="0" w:color="9AA5B1"/>
-              <w:right w:val="single" w:sz="4" w:space="0" w:color="9AA5B1"/>
+              <w:top w:val="single" w:color="9AA5B1" w:sz="4" w:space="0"/>
+              <w:left w:val="single" w:color="9AA5B1" w:sz="4" w:space="0"/>
+              <w:bottom w:val="single" w:color="9AA5B1" w:sz="4" w:space="0"/>
+              <w:right w:val="single" w:color="9AA5B1" w:sz="4" w:space="0"/>
             </w:tcBorders>
             <w:tcMar>
               <w:top w:w="60" w:type="dxa"/>
@@ -1717,10 +1717,10 @@
           <w:tcPr>
             <w:tcW w:w="2340" w:type="dxa"/>
             <w:tcBorders>
-              <w:top w:val="single" w:sz="4" w:space="0" w:color="9AA5B1"/>
-              <w:left w:val="single" w:sz="4" w:space="0" w:color="9AA5B1"/>
-              <w:bottom w:val="single" w:sz="4" w:space="0" w:color="9AA5B1"/>
-              <w:right w:val="single" w:sz="4" w:space="0" w:color="9AA5B1"/>
+              <w:top w:val="single" w:color="9AA5B1" w:sz="4" w:space="0"/>
+              <w:left w:val="single" w:color="9AA5B1" w:sz="4" w:space="0"/>
+              <w:bottom w:val="single" w:color="9AA5B1" w:sz="4" w:space="0"/>
+              <w:right w:val="single" w:color="9AA5B1" w:sz="4" w:space="0"/>
             </w:tcBorders>
             <w:tcMar>
               <w:top w:w="60" w:type="dxa"/>
@@ -1736,10 +1736,10 @@
           <w:tcPr>
             <w:tcW w:w="4680" w:type="dxa"/>
             <w:tcBorders>
-              <w:top w:val="single" w:sz="4" w:space="0" w:color="9AA5B1"/>
-              <w:left w:val="single" w:sz="4" w:space="0" w:color="9AA5B1"/>
-              <w:bottom w:val="single" w:sz="4" w:space="0" w:color="9AA5B1"/>
-              <w:right w:val="single" w:sz="4" w:space="0" w:color="9AA5B1"/>
+              <w:top w:val="single" w:color="9AA5B1" w:sz="4" w:space="0"/>
+              <w:left w:val="single" w:color="9AA5B1" w:sz="4" w:space="0"/>
+              <w:bottom w:val="single" w:color="9AA5B1" w:sz="4" w:space="0"/>
+              <w:right w:val="single" w:color="9AA5B1" w:sz="4" w:space="0"/>
             </w:tcBorders>
             <w:tcMar>
               <w:top w:w="60" w:type="dxa"/>
@@ -1755,10 +1755,10 @@
           <w:tcPr>
             <w:tcW w:w="2340" w:type="dxa"/>
             <w:tcBorders>
-              <w:top w:val="single" w:sz="4" w:space="0" w:color="9AA5B1"/>
-              <w:left w:val="single" w:sz="4" w:space="0" w:color="9AA5B1"/>
-              <w:bottom w:val="single" w:sz="4" w:space="0" w:color="9AA5B1"/>
-              <w:right w:val="single" w:sz="4" w:space="0" w:color="9AA5B1"/>
+              <w:top w:val="single" w:color="9AA5B1" w:sz="4" w:space="0"/>
+              <w:left w:val="single" w:color="9AA5B1" w:sz="4" w:space="0"/>
+              <w:bottom w:val="single" w:color="9AA5B1" w:sz="4" w:space="0"/>
+              <w:right w:val="single" w:color="9AA5B1" w:sz="4" w:space="0"/>
             </w:tcBorders>
             <w:tcMar>
               <w:top w:w="60" w:type="dxa"/>
@@ -1779,10 +1779,10 @@
           <w:tcPr>
             <w:tcW w:w="2340" w:type="dxa"/>
             <w:tcBorders>
-              <w:top w:val="single" w:sz="4" w:space="0" w:color="9AA5B1"/>
-              <w:left w:val="single" w:sz="4" w:space="0" w:color="9AA5B1"/>
-              <w:bottom w:val="single" w:sz="4" w:space="0" w:color="9AA5B1"/>
-              <w:right w:val="single" w:sz="4" w:space="0" w:color="9AA5B1"/>
+              <w:top w:val="single" w:color="9AA5B1" w:sz="4" w:space="0"/>
+              <w:left w:val="single" w:color="9AA5B1" w:sz="4" w:space="0"/>
+              <w:bottom w:val="single" w:color="9AA5B1" w:sz="4" w:space="0"/>
+              <w:right w:val="single" w:color="9AA5B1" w:sz="4" w:space="0"/>
             </w:tcBorders>
             <w:tcMar>
               <w:top w:w="60" w:type="dxa"/>
@@ -1798,10 +1798,10 @@
           <w:tcPr>
             <w:tcW w:w="4680" w:type="dxa"/>
             <w:tcBorders>
-              <w:top w:val="single" w:sz="4" w:space="0" w:color="9AA5B1"/>
-              <w:left w:val="single" w:sz="4" w:space="0" w:color="9AA5B1"/>
-              <w:bottom w:val="single" w:sz="4" w:space="0" w:color="9AA5B1"/>
-              <w:right w:val="single" w:sz="4" w:space="0" w:color="9AA5B1"/>
+              <w:top w:val="single" w:color="9AA5B1" w:sz="4" w:space="0"/>
+              <w:left w:val="single" w:color="9AA5B1" w:sz="4" w:space="0"/>
+              <w:bottom w:val="single" w:color="9AA5B1" w:sz="4" w:space="0"/>
+              <w:right w:val="single" w:color="9AA5B1" w:sz="4" w:space="0"/>
             </w:tcBorders>
             <w:tcMar>
               <w:top w:w="60" w:type="dxa"/>
@@ -1817,10 +1817,10 @@
           <w:tcPr>
             <w:tcW w:w="2340" w:type="dxa"/>
             <w:tcBorders>
-              <w:top w:val="single" w:sz="4" w:space="0" w:color="9AA5B1"/>
-              <w:left w:val="single" w:sz="4" w:space="0" w:color="9AA5B1"/>
-              <w:bottom w:val="single" w:sz="4" w:space="0" w:color="9AA5B1"/>
-              <w:right w:val="single" w:sz="4" w:space="0" w:color="9AA5B1"/>
+              <w:top w:val="single" w:color="9AA5B1" w:sz="4" w:space="0"/>
+              <w:left w:val="single" w:color="9AA5B1" w:sz="4" w:space="0"/>
+              <w:bottom w:val="single" w:color="9AA5B1" w:sz="4" w:space="0"/>
+              <w:right w:val="single" w:color="9AA5B1" w:sz="4" w:space="0"/>
             </w:tcBorders>
             <w:tcMar>
               <w:top w:w="60" w:type="dxa"/>
@@ -1841,10 +1841,10 @@
           <w:tcPr>
             <w:tcW w:w="2340" w:type="dxa"/>
             <w:tcBorders>
-              <w:top w:val="single" w:sz="4" w:space="0" w:color="9AA5B1"/>
-              <w:left w:val="single" w:sz="4" w:space="0" w:color="9AA5B1"/>
-              <w:bottom w:val="single" w:sz="4" w:space="0" w:color="9AA5B1"/>
-              <w:right w:val="single" w:sz="4" w:space="0" w:color="9AA5B1"/>
+              <w:top w:val="single" w:color="9AA5B1" w:sz="4" w:space="0"/>
+              <w:left w:val="single" w:color="9AA5B1" w:sz="4" w:space="0"/>
+              <w:bottom w:val="single" w:color="9AA5B1" w:sz="4" w:space="0"/>
+              <w:right w:val="single" w:color="9AA5B1" w:sz="4" w:space="0"/>
             </w:tcBorders>
             <w:tcMar>
               <w:top w:w="60" w:type="dxa"/>
@@ -1860,10 +1860,10 @@
           <w:tcPr>
             <w:tcW w:w="4680" w:type="dxa"/>
             <w:tcBorders>
-              <w:top w:val="single" w:sz="4" w:space="0" w:color="9AA5B1"/>
-              <w:left w:val="single" w:sz="4" w:space="0" w:color="9AA5B1"/>
-              <w:bottom w:val="single" w:sz="4" w:space="0" w:color="9AA5B1"/>
-              <w:right w:val="single" w:sz="4" w:space="0" w:color="9AA5B1"/>
+              <w:top w:val="single" w:color="9AA5B1" w:sz="4" w:space="0"/>
+              <w:left w:val="single" w:color="9AA5B1" w:sz="4" w:space="0"/>
+              <w:bottom w:val="single" w:color="9AA5B1" w:sz="4" w:space="0"/>
+              <w:right w:val="single" w:color="9AA5B1" w:sz="4" w:space="0"/>
             </w:tcBorders>
             <w:tcMar>
               <w:top w:w="60" w:type="dxa"/>
@@ -1879,10 +1879,10 @@
           <w:tcPr>
             <w:tcW w:w="2340" w:type="dxa"/>
             <w:tcBorders>
-              <w:top w:val="single" w:sz="4" w:space="0" w:color="9AA5B1"/>
-              <w:left w:val="single" w:sz="4" w:space="0" w:color="9AA5B1"/>
-              <w:bottom w:val="single" w:sz="4" w:space="0" w:color="9AA5B1"/>
-              <w:right w:val="single" w:sz="4" w:space="0" w:color="9AA5B1"/>
+              <w:top w:val="single" w:color="9AA5B1" w:sz="4" w:space="0"/>
+              <w:left w:val="single" w:color="9AA5B1" w:sz="4" w:space="0"/>
+              <w:bottom w:val="single" w:color="9AA5B1" w:sz="4" w:space="0"/>
+              <w:right w:val="single" w:color="9AA5B1" w:sz="4" w:space="0"/>
             </w:tcBorders>
             <w:tcMar>
               <w:top w:w="60" w:type="dxa"/>
@@ -1903,10 +1903,10 @@
           <w:tcPr>
             <w:tcW w:w="2340" w:type="dxa"/>
             <w:tcBorders>
-              <w:top w:val="single" w:sz="4" w:space="0" w:color="9AA5B1"/>
-              <w:left w:val="single" w:sz="4" w:space="0" w:color="9AA5B1"/>
-              <w:bottom w:val="single" w:sz="4" w:space="0" w:color="9AA5B1"/>
-              <w:right w:val="single" w:sz="4" w:space="0" w:color="9AA5B1"/>
+              <w:top w:val="single" w:color="9AA5B1" w:sz="4" w:space="0"/>
+              <w:left w:val="single" w:color="9AA5B1" w:sz="4" w:space="0"/>
+              <w:bottom w:val="single" w:color="9AA5B1" w:sz="4" w:space="0"/>
+              <w:right w:val="single" w:color="9AA5B1" w:sz="4" w:space="0"/>
             </w:tcBorders>
             <w:tcMar>
               <w:top w:w="60" w:type="dxa"/>
@@ -1922,10 +1922,10 @@
           <w:tcPr>
             <w:tcW w:w="4680" w:type="dxa"/>
             <w:tcBorders>
-              <w:top w:val="single" w:sz="4" w:space="0" w:color="9AA5B1"/>
-              <w:left w:val="single" w:sz="4" w:space="0" w:color="9AA5B1"/>
-              <w:bottom w:val="single" w:sz="4" w:space="0" w:color="9AA5B1"/>
-              <w:right w:val="single" w:sz="4" w:space="0" w:color="9AA5B1"/>
+              <w:top w:val="single" w:color="9AA5B1" w:sz="4" w:space="0"/>
+              <w:left w:val="single" w:color="9AA5B1" w:sz="4" w:space="0"/>
+              <w:bottom w:val="single" w:color="9AA5B1" w:sz="4" w:space="0"/>
+              <w:right w:val="single" w:color="9AA5B1" w:sz="4" w:space="0"/>
             </w:tcBorders>
             <w:tcMar>
               <w:top w:w="60" w:type="dxa"/>
@@ -1941,10 +1941,10 @@
           <w:tcPr>
             <w:tcW w:w="2340" w:type="dxa"/>
             <w:tcBorders>
-              <w:top w:val="single" w:sz="4" w:space="0" w:color="9AA5B1"/>
-              <w:left w:val="single" w:sz="4" w:space="0" w:color="9AA5B1"/>
-              <w:bottom w:val="single" w:sz="4" w:space="0" w:color="9AA5B1"/>
-              <w:right w:val="single" w:sz="4" w:space="0" w:color="9AA5B1"/>
+              <w:top w:val="single" w:color="9AA5B1" w:sz="4" w:space="0"/>
+              <w:left w:val="single" w:color="9AA5B1" w:sz="4" w:space="0"/>
+              <w:bottom w:val="single" w:color="9AA5B1" w:sz="4" w:space="0"/>
+              <w:right w:val="single" w:color="9AA5B1" w:sz="4" w:space="0"/>
             </w:tcBorders>
             <w:tcMar>
               <w:top w:w="60" w:type="dxa"/>
@@ -1967,12 +1967,12 @@
       <w:tblPr>
         <w:tblW w:w="9360" w:type="dxa"/>
         <w:tblBorders>
-          <w:top w:val="single" w:sz="4" w:space="0" w:color="auto"/>
-          <w:left w:val="single" w:sz="4" w:space="0" w:color="auto"/>
-          <w:bottom w:val="single" w:sz="4" w:space="0" w:color="auto"/>
-          <w:right w:val="single" w:sz="4" w:space="0" w:color="auto"/>
-          <w:insideH w:val="single" w:sz="4" w:space="0" w:color="auto"/>
-          <w:insideV w:val="single" w:sz="4" w:space="0" w:color="auto"/>
+          <w:top w:val="single" w:color="auto" w:sz="4" w:space="0"/>
+          <w:left w:val="single" w:color="auto" w:sz="4" w:space="0"/>
+          <w:bottom w:val="single" w:color="auto" w:sz="4" w:space="0"/>
+          <w:right w:val="single" w:color="auto" w:sz="4" w:space="0"/>
+          <w:insideH w:val="single" w:color="auto" w:sz="4" w:space="0"/>
+          <w:insideV w:val="single" w:color="auto" w:sz="4" w:space="0"/>
         </w:tblBorders>
         <w:tblCellMar>
           <w:left w:w="10" w:type="dxa"/>
@@ -1988,10 +1988,10 @@
           <w:tcPr>
             <w:tcW w:w="9360" w:type="dxa"/>
             <w:tcBorders>
-              <w:top w:val="none" w:sz="0" w:space="0" w:color="FFFFFF"/>
-              <w:left w:val="none" w:sz="0" w:space="0" w:color="FFFFFF"/>
-              <w:bottom w:val="none" w:sz="0" w:space="0" w:color="FFFFFF"/>
-              <w:right w:val="none" w:sz="0" w:space="0" w:color="FFFFFF"/>
+              <w:top w:val="none" w:color="FFFFFF" w:sz="0" w:space="0"/>
+              <w:left w:val="none" w:color="FFFFFF" w:sz="0" w:space="0"/>
+              <w:bottom w:val="none" w:color="FFFFFF" w:sz="0" w:space="0"/>
+              <w:right w:val="none" w:color="FFFFFF" w:sz="0" w:space="0"/>
             </w:tcBorders>
             <w:shd w:val="clear" w:color="auto" w:fill="0051BA"/>
             <w:tcMar>
@@ -2035,12 +2035,12 @@
       <w:tblPr>
         <w:tblW w:w="9360" w:type="dxa"/>
         <w:tblBorders>
-          <w:top w:val="single" w:sz="4" w:space="0" w:color="auto"/>
-          <w:left w:val="single" w:sz="4" w:space="0" w:color="auto"/>
-          <w:bottom w:val="single" w:sz="4" w:space="0" w:color="auto"/>
-          <w:right w:val="single" w:sz="4" w:space="0" w:color="auto"/>
-          <w:insideH w:val="single" w:sz="4" w:space="0" w:color="auto"/>
-          <w:insideV w:val="single" w:sz="4" w:space="0" w:color="auto"/>
+          <w:top w:val="single" w:color="auto" w:sz="4" w:space="0"/>
+          <w:left w:val="single" w:color="auto" w:sz="4" w:space="0"/>
+          <w:bottom w:val="single" w:color="auto" w:sz="4" w:space="0"/>
+          <w:right w:val="single" w:color="auto" w:sz="4" w:space="0"/>
+          <w:insideH w:val="single" w:color="auto" w:sz="4" w:space="0"/>
+          <w:insideV w:val="single" w:color="auto" w:sz="4" w:space="0"/>
         </w:tblBorders>
         <w:tblCellMar>
           <w:left w:w="10" w:type="dxa"/>
@@ -2059,10 +2059,10 @@
           <w:tcPr>
             <w:tcW w:w="9360" w:type="dxa"/>
             <w:tcBorders>
-              <w:top w:val="single" w:sz="4" w:space="0" w:color="9AA5B1"/>
-              <w:left w:val="single" w:sz="4" w:space="0" w:color="9AA5B1"/>
-              <w:bottom w:val="single" w:sz="4" w:space="0" w:color="9AA5B1"/>
-              <w:right w:val="single" w:sz="4" w:space="0" w:color="9AA5B1"/>
+              <w:top w:val="single" w:color="9AA5B1" w:sz="4" w:space="0"/>
+              <w:left w:val="single" w:color="9AA5B1" w:sz="4" w:space="0"/>
+              <w:bottom w:val="single" w:color="9AA5B1" w:sz="4" w:space="0"/>
+              <w:right w:val="single" w:color="9AA5B1" w:sz="4" w:space="0"/>
             </w:tcBorders>
             <w:tcMar>
               <w:top w:w="80" w:type="dxa"/>
@@ -2088,12 +2088,12 @@
       <w:tblPr>
         <w:tblW w:w="9360" w:type="dxa"/>
         <w:tblBorders>
-          <w:top w:val="single" w:sz="4" w:space="0" w:color="auto"/>
-          <w:left w:val="single" w:sz="4" w:space="0" w:color="auto"/>
-          <w:bottom w:val="single" w:sz="4" w:space="0" w:color="auto"/>
-          <w:right w:val="single" w:sz="4" w:space="0" w:color="auto"/>
-          <w:insideH w:val="single" w:sz="4" w:space="0" w:color="auto"/>
-          <w:insideV w:val="single" w:sz="4" w:space="0" w:color="auto"/>
+          <w:top w:val="single" w:color="auto" w:sz="4" w:space="0"/>
+          <w:left w:val="single" w:color="auto" w:sz="4" w:space="0"/>
+          <w:bottom w:val="single" w:color="auto" w:sz="4" w:space="0"/>
+          <w:right w:val="single" w:color="auto" w:sz="4" w:space="0"/>
+          <w:insideH w:val="single" w:color="auto" w:sz="4" w:space="0"/>
+          <w:insideV w:val="single" w:color="auto" w:sz="4" w:space="0"/>
         </w:tblBorders>
         <w:tblCellMar>
           <w:left w:w="10" w:type="dxa"/>
@@ -2109,10 +2109,10 @@
           <w:tcPr>
             <w:tcW w:w="9360" w:type="dxa"/>
             <w:tcBorders>
-              <w:top w:val="none" w:sz="0" w:space="0" w:color="FFFFFF"/>
-              <w:left w:val="none" w:sz="0" w:space="0" w:color="FFFFFF"/>
-              <w:bottom w:val="none" w:sz="0" w:space="0" w:color="FFFFFF"/>
-              <w:right w:val="none" w:sz="0" w:space="0" w:color="FFFFFF"/>
+              <w:top w:val="none" w:color="FFFFFF" w:sz="0" w:space="0"/>
+              <w:left w:val="none" w:color="FFFFFF" w:sz="0" w:space="0"/>
+              <w:bottom w:val="none" w:color="FFFFFF" w:sz="0" w:space="0"/>
+              <w:right w:val="none" w:color="FFFFFF" w:sz="0" w:space="0"/>
             </w:tcBorders>
             <w:shd w:val="clear" w:color="auto" w:fill="0051BA"/>
             <w:tcMar>
@@ -2156,12 +2156,12 @@
       <w:tblPr>
         <w:tblW w:w="9360" w:type="dxa"/>
         <w:tblBorders>
-          <w:top w:val="single" w:sz="4" w:space="0" w:color="auto"/>
-          <w:left w:val="single" w:sz="4" w:space="0" w:color="auto"/>
-          <w:bottom w:val="single" w:sz="4" w:space="0" w:color="auto"/>
-          <w:right w:val="single" w:sz="4" w:space="0" w:color="auto"/>
-          <w:insideH w:val="single" w:sz="4" w:space="0" w:color="auto"/>
-          <w:insideV w:val="single" w:sz="4" w:space="0" w:color="auto"/>
+          <w:top w:val="single" w:color="auto" w:sz="4" w:space="0"/>
+          <w:left w:val="single" w:color="auto" w:sz="4" w:space="0"/>
+          <w:bottom w:val="single" w:color="auto" w:sz="4" w:space="0"/>
+          <w:right w:val="single" w:color="auto" w:sz="4" w:space="0"/>
+          <w:insideH w:val="single" w:color="auto" w:sz="4" w:space="0"/>
+          <w:insideV w:val="single" w:color="auto" w:sz="4" w:space="0"/>
         </w:tblBorders>
         <w:tblCellMar>
           <w:left w:w="10" w:type="dxa"/>
@@ -2180,10 +2180,10 @@
           <w:tcPr>
             <w:tcW w:w="9360" w:type="dxa"/>
             <w:tcBorders>
-              <w:top w:val="single" w:sz="4" w:space="0" w:color="9AA5B1"/>
-              <w:left w:val="single" w:sz="4" w:space="0" w:color="9AA5B1"/>
-              <w:bottom w:val="single" w:sz="4" w:space="0" w:color="9AA5B1"/>
-              <w:right w:val="single" w:sz="4" w:space="0" w:color="9AA5B1"/>
+              <w:top w:val="single" w:color="9AA5B1" w:sz="4" w:space="0"/>
+              <w:left w:val="single" w:color="9AA5B1" w:sz="4" w:space="0"/>
+              <w:bottom w:val="single" w:color="9AA5B1" w:sz="4" w:space="0"/>
+              <w:right w:val="single" w:color="9AA5B1" w:sz="4" w:space="0"/>
             </w:tcBorders>
             <w:tcMar>
               <w:top w:w="80" w:type="dxa"/>
@@ -2192,7 +2192,40 @@
               <w:right w:w="120" w:type="dxa"/>
             </w:tcMar>
           </w:tcPr>
-          <w:p/>
+          <w:p>
+            <w:pPr>
+              <w:pStyle w:val="Normal"/>
+              <w:suppressLineNumbers w:val="0"/>
+              <w:bidi w:val="0"/>
+              <w:spacing w:before="0" w:beforeAutospacing="off" w:after="0" w:afterAutospacing="off" w:line="259" w:lineRule="auto"/>
+              <w:ind w:left="0" w:right="0"/>
+              <w:jc w:val="left"/>
+            </w:pPr>
+            <w:r>
+              <w:rPr/>
+              <w:t>The team missed the first</w:t>
+            </w:r>
+            <w:r>
+              <w:rPr/>
+              <w:t xml:space="preserve"> week’s</w:t>
+            </w:r>
+            <w:r>
+              <w:rPr/>
+              <w:t xml:space="preserve"> meeting due to scheduling conflict</w:t>
+            </w:r>
+            <w:r>
+              <w:rPr/>
+              <w:t>s</w:t>
+            </w:r>
+            <w:r>
+              <w:rPr/>
+              <w:t>.</w:t>
+            </w:r>
+            <w:r>
+              <w:rPr/>
+              <w:t xml:space="preserve"> Until the second week’s meeting, the team discussed roles and responsibilities over Messages.</w:t>
+            </w:r>
+          </w:p>
         </w:tc>
       </w:tr>
     </w:tbl>
@@ -2205,12 +2238,12 @@
       <w:tblPr>
         <w:tblW w:w="9360" w:type="dxa"/>
         <w:tblBorders>
-          <w:top w:val="single" w:sz="4" w:space="0" w:color="auto"/>
-          <w:left w:val="single" w:sz="4" w:space="0" w:color="auto"/>
-          <w:bottom w:val="single" w:sz="4" w:space="0" w:color="auto"/>
-          <w:right w:val="single" w:sz="4" w:space="0" w:color="auto"/>
-          <w:insideH w:val="single" w:sz="4" w:space="0" w:color="auto"/>
-          <w:insideV w:val="single" w:sz="4" w:space="0" w:color="auto"/>
+          <w:top w:val="single" w:color="auto" w:sz="4" w:space="0"/>
+          <w:left w:val="single" w:color="auto" w:sz="4" w:space="0"/>
+          <w:bottom w:val="single" w:color="auto" w:sz="4" w:space="0"/>
+          <w:right w:val="single" w:color="auto" w:sz="4" w:space="0"/>
+          <w:insideH w:val="single" w:color="auto" w:sz="4" w:space="0"/>
+          <w:insideV w:val="single" w:color="auto" w:sz="4" w:space="0"/>
         </w:tblBorders>
         <w:tblCellMar>
           <w:left w:w="10" w:type="dxa"/>
@@ -2226,10 +2259,10 @@
           <w:tcPr>
             <w:tcW w:w="9360" w:type="dxa"/>
             <w:tcBorders>
-              <w:top w:val="none" w:sz="0" w:space="0" w:color="FFFFFF"/>
-              <w:left w:val="none" w:sz="0" w:space="0" w:color="FFFFFF"/>
-              <w:bottom w:val="none" w:sz="0" w:space="0" w:color="FFFFFF"/>
-              <w:right w:val="none" w:sz="0" w:space="0" w:color="FFFFFF"/>
+              <w:top w:val="none" w:color="FFFFFF" w:sz="0" w:space="0"/>
+              <w:left w:val="none" w:color="FFFFFF" w:sz="0" w:space="0"/>
+              <w:bottom w:val="none" w:color="FFFFFF" w:sz="0" w:space="0"/>
+              <w:right w:val="none" w:color="FFFFFF" w:sz="0" w:space="0"/>
             </w:tcBorders>
             <w:shd w:val="clear" w:color="auto" w:fill="0051BA"/>
             <w:tcMar>
@@ -2273,12 +2306,12 @@
       <w:tblPr>
         <w:tblW w:w="9360" w:type="dxa"/>
         <w:tblBorders>
-          <w:top w:val="single" w:sz="4" w:space="0" w:color="auto"/>
-          <w:left w:val="single" w:sz="4" w:space="0" w:color="auto"/>
-          <w:bottom w:val="single" w:sz="4" w:space="0" w:color="auto"/>
-          <w:right w:val="single" w:sz="4" w:space="0" w:color="auto"/>
-          <w:insideH w:val="single" w:sz="4" w:space="0" w:color="auto"/>
-          <w:insideV w:val="single" w:sz="4" w:space="0" w:color="auto"/>
+          <w:top w:val="single" w:color="auto" w:sz="4" w:space="0"/>
+          <w:left w:val="single" w:color="auto" w:sz="4" w:space="0"/>
+          <w:bottom w:val="single" w:color="auto" w:sz="4" w:space="0"/>
+          <w:right w:val="single" w:color="auto" w:sz="4" w:space="0"/>
+          <w:insideH w:val="single" w:color="auto" w:sz="4" w:space="0"/>
+          <w:insideV w:val="single" w:color="auto" w:sz="4" w:space="0"/>
         </w:tblBorders>
         <w:tblCellMar>
           <w:left w:w="10" w:type="dxa"/>
@@ -2300,10 +2333,10 @@
           <w:tcPr>
             <w:tcW w:w="2100" w:type="dxa"/>
             <w:tcBorders>
-              <w:top w:val="single" w:sz="4" w:space="0" w:color="9AA5B1"/>
-              <w:left w:val="single" w:sz="4" w:space="0" w:color="9AA5B1"/>
-              <w:bottom w:val="single" w:sz="4" w:space="0" w:color="9AA5B1"/>
-              <w:right w:val="single" w:sz="4" w:space="0" w:color="9AA5B1"/>
+              <w:top w:val="single" w:color="9AA5B1" w:sz="4" w:space="0"/>
+              <w:left w:val="single" w:color="9AA5B1" w:sz="4" w:space="0"/>
+              <w:bottom w:val="single" w:color="9AA5B1" w:sz="4" w:space="0"/>
+              <w:right w:val="single" w:color="9AA5B1" w:sz="4" w:space="0"/>
             </w:tcBorders>
             <w:shd w:val="clear" w:color="auto" w:fill="0051BA"/>
             <w:tcMar>
@@ -2331,10 +2364,10 @@
           <w:tcPr>
             <w:tcW w:w="4560" w:type="dxa"/>
             <w:tcBorders>
-              <w:top w:val="single" w:sz="4" w:space="0" w:color="9AA5B1"/>
-              <w:left w:val="single" w:sz="4" w:space="0" w:color="9AA5B1"/>
-              <w:bottom w:val="single" w:sz="4" w:space="0" w:color="9AA5B1"/>
-              <w:right w:val="single" w:sz="4" w:space="0" w:color="9AA5B1"/>
+              <w:top w:val="single" w:color="9AA5B1" w:sz="4" w:space="0"/>
+              <w:left w:val="single" w:color="9AA5B1" w:sz="4" w:space="0"/>
+              <w:bottom w:val="single" w:color="9AA5B1" w:sz="4" w:space="0"/>
+              <w:right w:val="single" w:color="9AA5B1" w:sz="4" w:space="0"/>
             </w:tcBorders>
             <w:shd w:val="clear" w:color="auto" w:fill="0051BA"/>
             <w:tcMar>
@@ -2362,10 +2395,10 @@
           <w:tcPr>
             <w:tcW w:w="1400" w:type="dxa"/>
             <w:tcBorders>
-              <w:top w:val="single" w:sz="4" w:space="0" w:color="9AA5B1"/>
-              <w:left w:val="single" w:sz="4" w:space="0" w:color="9AA5B1"/>
-              <w:bottom w:val="single" w:sz="4" w:space="0" w:color="9AA5B1"/>
-              <w:right w:val="single" w:sz="4" w:space="0" w:color="9AA5B1"/>
+              <w:top w:val="single" w:color="9AA5B1" w:sz="4" w:space="0"/>
+              <w:left w:val="single" w:color="9AA5B1" w:sz="4" w:space="0"/>
+              <w:bottom w:val="single" w:color="9AA5B1" w:sz="4" w:space="0"/>
+              <w:right w:val="single" w:color="9AA5B1" w:sz="4" w:space="0"/>
             </w:tcBorders>
             <w:shd w:val="clear" w:color="auto" w:fill="0051BA"/>
             <w:tcMar>
@@ -2393,10 +2426,10 @@
           <w:tcPr>
             <w:tcW w:w="1300" w:type="dxa"/>
             <w:tcBorders>
-              <w:top w:val="single" w:sz="4" w:space="0" w:color="9AA5B1"/>
-              <w:left w:val="single" w:sz="4" w:space="0" w:color="9AA5B1"/>
-              <w:bottom w:val="single" w:sz="4" w:space="0" w:color="9AA5B1"/>
-              <w:right w:val="single" w:sz="4" w:space="0" w:color="9AA5B1"/>
+              <w:top w:val="single" w:color="9AA5B1" w:sz="4" w:space="0"/>
+              <w:left w:val="single" w:color="9AA5B1" w:sz="4" w:space="0"/>
+              <w:bottom w:val="single" w:color="9AA5B1" w:sz="4" w:space="0"/>
+              <w:right w:val="single" w:color="9AA5B1" w:sz="4" w:space="0"/>
             </w:tcBorders>
             <w:shd w:val="clear" w:color="auto" w:fill="0051BA"/>
             <w:tcMar>
@@ -2429,10 +2462,10 @@
           <w:tcPr>
             <w:tcW w:w="2100" w:type="dxa"/>
             <w:tcBorders>
-              <w:top w:val="single" w:sz="4" w:space="0" w:color="9AA5B1"/>
-              <w:left w:val="single" w:sz="4" w:space="0" w:color="9AA5B1"/>
-              <w:bottom w:val="single" w:sz="4" w:space="0" w:color="9AA5B1"/>
-              <w:right w:val="single" w:sz="4" w:space="0" w:color="9AA5B1"/>
+              <w:top w:val="single" w:color="9AA5B1" w:sz="4" w:space="0"/>
+              <w:left w:val="single" w:color="9AA5B1" w:sz="4" w:space="0"/>
+              <w:bottom w:val="single" w:color="9AA5B1" w:sz="4" w:space="0"/>
+              <w:right w:val="single" w:color="9AA5B1" w:sz="4" w:space="0"/>
             </w:tcBorders>
             <w:tcMar>
               <w:top w:w="60" w:type="dxa"/>
@@ -2452,10 +2485,10 @@
           <w:tcPr>
             <w:tcW w:w="4560" w:type="dxa"/>
             <w:tcBorders>
-              <w:top w:val="single" w:sz="4" w:space="0" w:color="9AA5B1"/>
-              <w:left w:val="single" w:sz="4" w:space="0" w:color="9AA5B1"/>
-              <w:bottom w:val="single" w:sz="4" w:space="0" w:color="9AA5B1"/>
-              <w:right w:val="single" w:sz="4" w:space="0" w:color="9AA5B1"/>
+              <w:top w:val="single" w:color="9AA5B1" w:sz="4" w:space="0"/>
+              <w:left w:val="single" w:color="9AA5B1" w:sz="4" w:space="0"/>
+              <w:bottom w:val="single" w:color="9AA5B1" w:sz="4" w:space="0"/>
+              <w:right w:val="single" w:color="9AA5B1" w:sz="4" w:space="0"/>
             </w:tcBorders>
             <w:tcMar>
               <w:top w:w="60" w:type="dxa"/>
@@ -2475,10 +2508,10 @@
           <w:tcPr>
             <w:tcW w:w="1400" w:type="dxa"/>
             <w:tcBorders>
-              <w:top w:val="single" w:sz="4" w:space="0" w:color="9AA5B1"/>
-              <w:left w:val="single" w:sz="4" w:space="0" w:color="9AA5B1"/>
-              <w:bottom w:val="single" w:sz="4" w:space="0" w:color="9AA5B1"/>
-              <w:right w:val="single" w:sz="4" w:space="0" w:color="9AA5B1"/>
+              <w:top w:val="single" w:color="9AA5B1" w:sz="4" w:space="0"/>
+              <w:left w:val="single" w:color="9AA5B1" w:sz="4" w:space="0"/>
+              <w:bottom w:val="single" w:color="9AA5B1" w:sz="4" w:space="0"/>
+              <w:right w:val="single" w:color="9AA5B1" w:sz="4" w:space="0"/>
             </w:tcBorders>
             <w:tcMar>
               <w:top w:w="60" w:type="dxa"/>
@@ -2498,10 +2531,10 @@
           <w:tcPr>
             <w:tcW w:w="1300" w:type="dxa"/>
             <w:tcBorders>
-              <w:top w:val="single" w:sz="4" w:space="0" w:color="9AA5B1"/>
-              <w:left w:val="single" w:sz="4" w:space="0" w:color="9AA5B1"/>
-              <w:bottom w:val="single" w:sz="4" w:space="0" w:color="9AA5B1"/>
-              <w:right w:val="single" w:sz="4" w:space="0" w:color="9AA5B1"/>
+              <w:top w:val="single" w:color="9AA5B1" w:sz="4" w:space="0"/>
+              <w:left w:val="single" w:color="9AA5B1" w:sz="4" w:space="0"/>
+              <w:bottom w:val="single" w:color="9AA5B1" w:sz="4" w:space="0"/>
+              <w:right w:val="single" w:color="9AA5B1" w:sz="4" w:space="0"/>
             </w:tcBorders>
             <w:tcMar>
               <w:top w:w="60" w:type="dxa"/>
@@ -2526,10 +2559,10 @@
           <w:tcPr>
             <w:tcW w:w="2100" w:type="dxa"/>
             <w:tcBorders>
-              <w:top w:val="single" w:sz="4" w:space="0" w:color="9AA5B1"/>
-              <w:left w:val="single" w:sz="4" w:space="0" w:color="9AA5B1"/>
-              <w:bottom w:val="single" w:sz="4" w:space="0" w:color="9AA5B1"/>
-              <w:right w:val="single" w:sz="4" w:space="0" w:color="9AA5B1"/>
+              <w:top w:val="single" w:color="9AA5B1" w:sz="4" w:space="0"/>
+              <w:left w:val="single" w:color="9AA5B1" w:sz="4" w:space="0"/>
+              <w:bottom w:val="single" w:color="9AA5B1" w:sz="4" w:space="0"/>
+              <w:right w:val="single" w:color="9AA5B1" w:sz="4" w:space="0"/>
             </w:tcBorders>
             <w:tcMar>
               <w:top w:w="60" w:type="dxa"/>
@@ -2549,10 +2582,10 @@
           <w:tcPr>
             <w:tcW w:w="4560" w:type="dxa"/>
             <w:tcBorders>
-              <w:top w:val="single" w:sz="4" w:space="0" w:color="9AA5B1"/>
-              <w:left w:val="single" w:sz="4" w:space="0" w:color="9AA5B1"/>
-              <w:bottom w:val="single" w:sz="4" w:space="0" w:color="9AA5B1"/>
-              <w:right w:val="single" w:sz="4" w:space="0" w:color="9AA5B1"/>
+              <w:top w:val="single" w:color="9AA5B1" w:sz="4" w:space="0"/>
+              <w:left w:val="single" w:color="9AA5B1" w:sz="4" w:space="0"/>
+              <w:bottom w:val="single" w:color="9AA5B1" w:sz="4" w:space="0"/>
+              <w:right w:val="single" w:color="9AA5B1" w:sz="4" w:space="0"/>
             </w:tcBorders>
             <w:tcMar>
               <w:top w:w="60" w:type="dxa"/>
@@ -2572,10 +2605,10 @@
           <w:tcPr>
             <w:tcW w:w="1400" w:type="dxa"/>
             <w:tcBorders>
-              <w:top w:val="single" w:sz="4" w:space="0" w:color="9AA5B1"/>
-              <w:left w:val="single" w:sz="4" w:space="0" w:color="9AA5B1"/>
-              <w:bottom w:val="single" w:sz="4" w:space="0" w:color="9AA5B1"/>
-              <w:right w:val="single" w:sz="4" w:space="0" w:color="9AA5B1"/>
+              <w:top w:val="single" w:color="9AA5B1" w:sz="4" w:space="0"/>
+              <w:left w:val="single" w:color="9AA5B1" w:sz="4" w:space="0"/>
+              <w:bottom w:val="single" w:color="9AA5B1" w:sz="4" w:space="0"/>
+              <w:right w:val="single" w:color="9AA5B1" w:sz="4" w:space="0"/>
             </w:tcBorders>
             <w:tcMar>
               <w:top w:w="60" w:type="dxa"/>
@@ -2595,10 +2628,10 @@
           <w:tcPr>
             <w:tcW w:w="1300" w:type="dxa"/>
             <w:tcBorders>
-              <w:top w:val="single" w:sz="4" w:space="0" w:color="9AA5B1"/>
-              <w:left w:val="single" w:sz="4" w:space="0" w:color="9AA5B1"/>
-              <w:bottom w:val="single" w:sz="4" w:space="0" w:color="9AA5B1"/>
-              <w:right w:val="single" w:sz="4" w:space="0" w:color="9AA5B1"/>
+              <w:top w:val="single" w:color="9AA5B1" w:sz="4" w:space="0"/>
+              <w:left w:val="single" w:color="9AA5B1" w:sz="4" w:space="0"/>
+              <w:bottom w:val="single" w:color="9AA5B1" w:sz="4" w:space="0"/>
+              <w:right w:val="single" w:color="9AA5B1" w:sz="4" w:space="0"/>
             </w:tcBorders>
             <w:tcMar>
               <w:top w:w="60" w:type="dxa"/>
@@ -2623,10 +2656,10 @@
           <w:tcPr>
             <w:tcW w:w="2100" w:type="dxa"/>
             <w:tcBorders>
-              <w:top w:val="single" w:sz="4" w:space="0" w:color="9AA5B1"/>
-              <w:left w:val="single" w:sz="4" w:space="0" w:color="9AA5B1"/>
-              <w:bottom w:val="single" w:sz="4" w:space="0" w:color="9AA5B1"/>
-              <w:right w:val="single" w:sz="4" w:space="0" w:color="9AA5B1"/>
+              <w:top w:val="single" w:color="9AA5B1" w:sz="4" w:space="0"/>
+              <w:left w:val="single" w:color="9AA5B1" w:sz="4" w:space="0"/>
+              <w:bottom w:val="single" w:color="9AA5B1" w:sz="4" w:space="0"/>
+              <w:right w:val="single" w:color="9AA5B1" w:sz="4" w:space="0"/>
             </w:tcBorders>
             <w:tcMar>
               <w:top w:w="60" w:type="dxa"/>
@@ -2646,10 +2679,10 @@
           <w:tcPr>
             <w:tcW w:w="4560" w:type="dxa"/>
             <w:tcBorders>
-              <w:top w:val="single" w:sz="4" w:space="0" w:color="9AA5B1"/>
-              <w:left w:val="single" w:sz="4" w:space="0" w:color="9AA5B1"/>
-              <w:bottom w:val="single" w:sz="4" w:space="0" w:color="9AA5B1"/>
-              <w:right w:val="single" w:sz="4" w:space="0" w:color="9AA5B1"/>
+              <w:top w:val="single" w:color="9AA5B1" w:sz="4" w:space="0"/>
+              <w:left w:val="single" w:color="9AA5B1" w:sz="4" w:space="0"/>
+              <w:bottom w:val="single" w:color="9AA5B1" w:sz="4" w:space="0"/>
+              <w:right w:val="single" w:color="9AA5B1" w:sz="4" w:space="0"/>
             </w:tcBorders>
             <w:tcMar>
               <w:top w:w="60" w:type="dxa"/>
@@ -2669,10 +2702,10 @@
           <w:tcPr>
             <w:tcW w:w="1400" w:type="dxa"/>
             <w:tcBorders>
-              <w:top w:val="single" w:sz="4" w:space="0" w:color="9AA5B1"/>
-              <w:left w:val="single" w:sz="4" w:space="0" w:color="9AA5B1"/>
-              <w:bottom w:val="single" w:sz="4" w:space="0" w:color="9AA5B1"/>
-              <w:right w:val="single" w:sz="4" w:space="0" w:color="9AA5B1"/>
+              <w:top w:val="single" w:color="9AA5B1" w:sz="4" w:space="0"/>
+              <w:left w:val="single" w:color="9AA5B1" w:sz="4" w:space="0"/>
+              <w:bottom w:val="single" w:color="9AA5B1" w:sz="4" w:space="0"/>
+              <w:right w:val="single" w:color="9AA5B1" w:sz="4" w:space="0"/>
             </w:tcBorders>
             <w:tcMar>
               <w:top w:w="60" w:type="dxa"/>
@@ -2692,10 +2725,10 @@
           <w:tcPr>
             <w:tcW w:w="1300" w:type="dxa"/>
             <w:tcBorders>
-              <w:top w:val="single" w:sz="4" w:space="0" w:color="9AA5B1"/>
-              <w:left w:val="single" w:sz="4" w:space="0" w:color="9AA5B1"/>
-              <w:bottom w:val="single" w:sz="4" w:space="0" w:color="9AA5B1"/>
-              <w:right w:val="single" w:sz="4" w:space="0" w:color="9AA5B1"/>
+              <w:top w:val="single" w:color="9AA5B1" w:sz="4" w:space="0"/>
+              <w:left w:val="single" w:color="9AA5B1" w:sz="4" w:space="0"/>
+              <w:bottom w:val="single" w:color="9AA5B1" w:sz="4" w:space="0"/>
+              <w:right w:val="single" w:color="9AA5B1" w:sz="4" w:space="0"/>
             </w:tcBorders>
             <w:tcMar>
               <w:top w:w="60" w:type="dxa"/>
@@ -2720,10 +2753,10 @@
           <w:tcPr>
             <w:tcW w:w="2100" w:type="dxa"/>
             <w:tcBorders>
-              <w:top w:val="single" w:sz="4" w:space="0" w:color="9AA5B1"/>
-              <w:left w:val="single" w:sz="4" w:space="0" w:color="9AA5B1"/>
-              <w:bottom w:val="single" w:sz="4" w:space="0" w:color="9AA5B1"/>
-              <w:right w:val="single" w:sz="4" w:space="0" w:color="9AA5B1"/>
+              <w:top w:val="single" w:color="9AA5B1" w:sz="4" w:space="0"/>
+              <w:left w:val="single" w:color="9AA5B1" w:sz="4" w:space="0"/>
+              <w:bottom w:val="single" w:color="9AA5B1" w:sz="4" w:space="0"/>
+              <w:right w:val="single" w:color="9AA5B1" w:sz="4" w:space="0"/>
             </w:tcBorders>
             <w:tcMar>
               <w:top w:w="60" w:type="dxa"/>
@@ -2743,10 +2776,10 @@
           <w:tcPr>
             <w:tcW w:w="4560" w:type="dxa"/>
             <w:tcBorders>
-              <w:top w:val="single" w:sz="4" w:space="0" w:color="9AA5B1"/>
-              <w:left w:val="single" w:sz="4" w:space="0" w:color="9AA5B1"/>
-              <w:bottom w:val="single" w:sz="4" w:space="0" w:color="9AA5B1"/>
-              <w:right w:val="single" w:sz="4" w:space="0" w:color="9AA5B1"/>
+              <w:top w:val="single" w:color="9AA5B1" w:sz="4" w:space="0"/>
+              <w:left w:val="single" w:color="9AA5B1" w:sz="4" w:space="0"/>
+              <w:bottom w:val="single" w:color="9AA5B1" w:sz="4" w:space="0"/>
+              <w:right w:val="single" w:color="9AA5B1" w:sz="4" w:space="0"/>
             </w:tcBorders>
             <w:tcMar>
               <w:top w:w="60" w:type="dxa"/>
@@ -2766,10 +2799,10 @@
           <w:tcPr>
             <w:tcW w:w="1400" w:type="dxa"/>
             <w:tcBorders>
-              <w:top w:val="single" w:sz="4" w:space="0" w:color="9AA5B1"/>
-              <w:left w:val="single" w:sz="4" w:space="0" w:color="9AA5B1"/>
-              <w:bottom w:val="single" w:sz="4" w:space="0" w:color="9AA5B1"/>
-              <w:right w:val="single" w:sz="4" w:space="0" w:color="9AA5B1"/>
+              <w:top w:val="single" w:color="9AA5B1" w:sz="4" w:space="0"/>
+              <w:left w:val="single" w:color="9AA5B1" w:sz="4" w:space="0"/>
+              <w:bottom w:val="single" w:color="9AA5B1" w:sz="4" w:space="0"/>
+              <w:right w:val="single" w:color="9AA5B1" w:sz="4" w:space="0"/>
             </w:tcBorders>
             <w:tcMar>
               <w:top w:w="60" w:type="dxa"/>
@@ -2789,10 +2822,10 @@
           <w:tcPr>
             <w:tcW w:w="1300" w:type="dxa"/>
             <w:tcBorders>
-              <w:top w:val="single" w:sz="4" w:space="0" w:color="9AA5B1"/>
-              <w:left w:val="single" w:sz="4" w:space="0" w:color="9AA5B1"/>
-              <w:bottom w:val="single" w:sz="4" w:space="0" w:color="9AA5B1"/>
-              <w:right w:val="single" w:sz="4" w:space="0" w:color="9AA5B1"/>
+              <w:top w:val="single" w:color="9AA5B1" w:sz="4" w:space="0"/>
+              <w:left w:val="single" w:color="9AA5B1" w:sz="4" w:space="0"/>
+              <w:bottom w:val="single" w:color="9AA5B1" w:sz="4" w:space="0"/>
+              <w:right w:val="single" w:color="9AA5B1" w:sz="4" w:space="0"/>
             </w:tcBorders>
             <w:tcMar>
               <w:top w:w="60" w:type="dxa"/>
@@ -2817,10 +2850,10 @@
           <w:tcPr>
             <w:tcW w:w="2100" w:type="dxa"/>
             <w:tcBorders>
-              <w:top w:val="single" w:sz="4" w:space="0" w:color="9AA5B1"/>
-              <w:left w:val="single" w:sz="4" w:space="0" w:color="9AA5B1"/>
-              <w:bottom w:val="single" w:sz="4" w:space="0" w:color="9AA5B1"/>
-              <w:right w:val="single" w:sz="4" w:space="0" w:color="9AA5B1"/>
+              <w:top w:val="single" w:color="9AA5B1" w:sz="4" w:space="0"/>
+              <w:left w:val="single" w:color="9AA5B1" w:sz="4" w:space="0"/>
+              <w:bottom w:val="single" w:color="9AA5B1" w:sz="4" w:space="0"/>
+              <w:right w:val="single" w:color="9AA5B1" w:sz="4" w:space="0"/>
             </w:tcBorders>
             <w:tcMar>
               <w:top w:w="60" w:type="dxa"/>
@@ -2840,10 +2873,10 @@
           <w:tcPr>
             <w:tcW w:w="4560" w:type="dxa"/>
             <w:tcBorders>
-              <w:top w:val="single" w:sz="4" w:space="0" w:color="9AA5B1"/>
-              <w:left w:val="single" w:sz="4" w:space="0" w:color="9AA5B1"/>
-              <w:bottom w:val="single" w:sz="4" w:space="0" w:color="9AA5B1"/>
-              <w:right w:val="single" w:sz="4" w:space="0" w:color="9AA5B1"/>
+              <w:top w:val="single" w:color="9AA5B1" w:sz="4" w:space="0"/>
+              <w:left w:val="single" w:color="9AA5B1" w:sz="4" w:space="0"/>
+              <w:bottom w:val="single" w:color="9AA5B1" w:sz="4" w:space="0"/>
+              <w:right w:val="single" w:color="9AA5B1" w:sz="4" w:space="0"/>
             </w:tcBorders>
             <w:tcMar>
               <w:top w:w="60" w:type="dxa"/>
@@ -2871,10 +2904,10 @@
           <w:tcPr>
             <w:tcW w:w="1400" w:type="dxa"/>
             <w:tcBorders>
-              <w:top w:val="single" w:sz="4" w:space="0" w:color="9AA5B1"/>
-              <w:left w:val="single" w:sz="4" w:space="0" w:color="9AA5B1"/>
-              <w:bottom w:val="single" w:sz="4" w:space="0" w:color="9AA5B1"/>
-              <w:right w:val="single" w:sz="4" w:space="0" w:color="9AA5B1"/>
+              <w:top w:val="single" w:color="9AA5B1" w:sz="4" w:space="0"/>
+              <w:left w:val="single" w:color="9AA5B1" w:sz="4" w:space="0"/>
+              <w:bottom w:val="single" w:color="9AA5B1" w:sz="4" w:space="0"/>
+              <w:right w:val="single" w:color="9AA5B1" w:sz="4" w:space="0"/>
             </w:tcBorders>
             <w:tcMar>
               <w:top w:w="60" w:type="dxa"/>
@@ -2894,10 +2927,10 @@
           <w:tcPr>
             <w:tcW w:w="1300" w:type="dxa"/>
             <w:tcBorders>
-              <w:top w:val="single" w:sz="4" w:space="0" w:color="9AA5B1"/>
-              <w:left w:val="single" w:sz="4" w:space="0" w:color="9AA5B1"/>
-              <w:bottom w:val="single" w:sz="4" w:space="0" w:color="9AA5B1"/>
-              <w:right w:val="single" w:sz="4" w:space="0" w:color="9AA5B1"/>
+              <w:top w:val="single" w:color="9AA5B1" w:sz="4" w:space="0"/>
+              <w:left w:val="single" w:color="9AA5B1" w:sz="4" w:space="0"/>
+              <w:bottom w:val="single" w:color="9AA5B1" w:sz="4" w:space="0"/>
+              <w:right w:val="single" w:color="9AA5B1" w:sz="4" w:space="0"/>
             </w:tcBorders>
             <w:tcMar>
               <w:top w:w="60" w:type="dxa"/>
@@ -2922,10 +2955,10 @@
           <w:tcPr>
             <w:tcW w:w="2100" w:type="dxa"/>
             <w:tcBorders>
-              <w:top w:val="single" w:sz="4" w:space="0" w:color="9AA5B1"/>
-              <w:left w:val="single" w:sz="4" w:space="0" w:color="9AA5B1"/>
-              <w:bottom w:val="single" w:sz="4" w:space="0" w:color="9AA5B1"/>
-              <w:right w:val="single" w:sz="4" w:space="0" w:color="9AA5B1"/>
+              <w:top w:val="single" w:color="9AA5B1" w:sz="4" w:space="0"/>
+              <w:left w:val="single" w:color="9AA5B1" w:sz="4" w:space="0"/>
+              <w:bottom w:val="single" w:color="9AA5B1" w:sz="4" w:space="0"/>
+              <w:right w:val="single" w:color="9AA5B1" w:sz="4" w:space="0"/>
             </w:tcBorders>
             <w:tcMar>
               <w:top w:w="60" w:type="dxa"/>
@@ -2945,10 +2978,10 @@
           <w:tcPr>
             <w:tcW w:w="4560" w:type="dxa"/>
             <w:tcBorders>
-              <w:top w:val="single" w:sz="4" w:space="0" w:color="9AA5B1"/>
-              <w:left w:val="single" w:sz="4" w:space="0" w:color="9AA5B1"/>
-              <w:bottom w:val="single" w:sz="4" w:space="0" w:color="9AA5B1"/>
-              <w:right w:val="single" w:sz="4" w:space="0" w:color="9AA5B1"/>
+              <w:top w:val="single" w:color="9AA5B1" w:sz="4" w:space="0"/>
+              <w:left w:val="single" w:color="9AA5B1" w:sz="4" w:space="0"/>
+              <w:bottom w:val="single" w:color="9AA5B1" w:sz="4" w:space="0"/>
+              <w:right w:val="single" w:color="9AA5B1" w:sz="4" w:space="0"/>
             </w:tcBorders>
             <w:tcMar>
               <w:top w:w="60" w:type="dxa"/>
@@ -2976,10 +3009,10 @@
           <w:tcPr>
             <w:tcW w:w="1400" w:type="dxa"/>
             <w:tcBorders>
-              <w:top w:val="single" w:sz="4" w:space="0" w:color="9AA5B1"/>
-              <w:left w:val="single" w:sz="4" w:space="0" w:color="9AA5B1"/>
-              <w:bottom w:val="single" w:sz="4" w:space="0" w:color="9AA5B1"/>
-              <w:right w:val="single" w:sz="4" w:space="0" w:color="9AA5B1"/>
+              <w:top w:val="single" w:color="9AA5B1" w:sz="4" w:space="0"/>
+              <w:left w:val="single" w:color="9AA5B1" w:sz="4" w:space="0"/>
+              <w:bottom w:val="single" w:color="9AA5B1" w:sz="4" w:space="0"/>
+              <w:right w:val="single" w:color="9AA5B1" w:sz="4" w:space="0"/>
             </w:tcBorders>
             <w:tcMar>
               <w:top w:w="60" w:type="dxa"/>
@@ -2999,10 +3032,10 @@
           <w:tcPr>
             <w:tcW w:w="1300" w:type="dxa"/>
             <w:tcBorders>
-              <w:top w:val="single" w:sz="4" w:space="0" w:color="9AA5B1"/>
-              <w:left w:val="single" w:sz="4" w:space="0" w:color="9AA5B1"/>
-              <w:bottom w:val="single" w:sz="4" w:space="0" w:color="9AA5B1"/>
-              <w:right w:val="single" w:sz="4" w:space="0" w:color="9AA5B1"/>
+              <w:top w:val="single" w:color="9AA5B1" w:sz="4" w:space="0"/>
+              <w:left w:val="single" w:color="9AA5B1" w:sz="4" w:space="0"/>
+              <w:bottom w:val="single" w:color="9AA5B1" w:sz="4" w:space="0"/>
+              <w:right w:val="single" w:color="9AA5B1" w:sz="4" w:space="0"/>
             </w:tcBorders>
             <w:tcMar>
               <w:top w:w="60" w:type="dxa"/>
@@ -3027,10 +3060,10 @@
           <w:tcPr>
             <w:tcW w:w="2100" w:type="dxa"/>
             <w:tcBorders>
-              <w:top w:val="single" w:sz="4" w:space="0" w:color="9AA5B1"/>
-              <w:left w:val="single" w:sz="4" w:space="0" w:color="9AA5B1"/>
-              <w:bottom w:val="single" w:sz="4" w:space="0" w:color="9AA5B1"/>
-              <w:right w:val="single" w:sz="4" w:space="0" w:color="9AA5B1"/>
+              <w:top w:val="single" w:color="9AA5B1" w:sz="4" w:space="0"/>
+              <w:left w:val="single" w:color="9AA5B1" w:sz="4" w:space="0"/>
+              <w:bottom w:val="single" w:color="9AA5B1" w:sz="4" w:space="0"/>
+              <w:right w:val="single" w:color="9AA5B1" w:sz="4" w:space="0"/>
             </w:tcBorders>
             <w:tcMar>
               <w:top w:w="60" w:type="dxa"/>
@@ -3046,10 +3079,10 @@
           <w:tcPr>
             <w:tcW w:w="4560" w:type="dxa"/>
             <w:tcBorders>
-              <w:top w:val="single" w:sz="4" w:space="0" w:color="9AA5B1"/>
-              <w:left w:val="single" w:sz="4" w:space="0" w:color="9AA5B1"/>
-              <w:bottom w:val="single" w:sz="4" w:space="0" w:color="9AA5B1"/>
-              <w:right w:val="single" w:sz="4" w:space="0" w:color="9AA5B1"/>
+              <w:top w:val="single" w:color="9AA5B1" w:sz="4" w:space="0"/>
+              <w:left w:val="single" w:color="9AA5B1" w:sz="4" w:space="0"/>
+              <w:bottom w:val="single" w:color="9AA5B1" w:sz="4" w:space="0"/>
+              <w:right w:val="single" w:color="9AA5B1" w:sz="4" w:space="0"/>
             </w:tcBorders>
             <w:tcMar>
               <w:top w:w="60" w:type="dxa"/>
@@ -3065,10 +3098,10 @@
           <w:tcPr>
             <w:tcW w:w="1400" w:type="dxa"/>
             <w:tcBorders>
-              <w:top w:val="single" w:sz="4" w:space="0" w:color="9AA5B1"/>
-              <w:left w:val="single" w:sz="4" w:space="0" w:color="9AA5B1"/>
-              <w:bottom w:val="single" w:sz="4" w:space="0" w:color="9AA5B1"/>
-              <w:right w:val="single" w:sz="4" w:space="0" w:color="9AA5B1"/>
+              <w:top w:val="single" w:color="9AA5B1" w:sz="4" w:space="0"/>
+              <w:left w:val="single" w:color="9AA5B1" w:sz="4" w:space="0"/>
+              <w:bottom w:val="single" w:color="9AA5B1" w:sz="4" w:space="0"/>
+              <w:right w:val="single" w:color="9AA5B1" w:sz="4" w:space="0"/>
             </w:tcBorders>
             <w:tcMar>
               <w:top w:w="60" w:type="dxa"/>
@@ -3084,10 +3117,10 @@
           <w:tcPr>
             <w:tcW w:w="1300" w:type="dxa"/>
             <w:tcBorders>
-              <w:top w:val="single" w:sz="4" w:space="0" w:color="9AA5B1"/>
-              <w:left w:val="single" w:sz="4" w:space="0" w:color="9AA5B1"/>
-              <w:bottom w:val="single" w:sz="4" w:space="0" w:color="9AA5B1"/>
-              <w:right w:val="single" w:sz="4" w:space="0" w:color="9AA5B1"/>
+              <w:top w:val="single" w:color="9AA5B1" w:sz="4" w:space="0"/>
+              <w:left w:val="single" w:color="9AA5B1" w:sz="4" w:space="0"/>
+              <w:bottom w:val="single" w:color="9AA5B1" w:sz="4" w:space="0"/>
+              <w:right w:val="single" w:color="9AA5B1" w:sz="4" w:space="0"/>
             </w:tcBorders>
             <w:tcMar>
               <w:top w:w="60" w:type="dxa"/>
@@ -3108,10 +3141,10 @@
           <w:tcPr>
             <w:tcW w:w="2100" w:type="dxa"/>
             <w:tcBorders>
-              <w:top w:val="single" w:sz="4" w:space="0" w:color="9AA5B1"/>
-              <w:left w:val="single" w:sz="4" w:space="0" w:color="9AA5B1"/>
-              <w:bottom w:val="single" w:sz="4" w:space="0" w:color="9AA5B1"/>
-              <w:right w:val="single" w:sz="4" w:space="0" w:color="9AA5B1"/>
+              <w:top w:val="single" w:color="9AA5B1" w:sz="4" w:space="0"/>
+              <w:left w:val="single" w:color="9AA5B1" w:sz="4" w:space="0"/>
+              <w:bottom w:val="single" w:color="9AA5B1" w:sz="4" w:space="0"/>
+              <w:right w:val="single" w:color="9AA5B1" w:sz="4" w:space="0"/>
             </w:tcBorders>
             <w:tcMar>
               <w:top w:w="60" w:type="dxa"/>
@@ -3127,10 +3160,10 @@
           <w:tcPr>
             <w:tcW w:w="4560" w:type="dxa"/>
             <w:tcBorders>
-              <w:top w:val="single" w:sz="4" w:space="0" w:color="9AA5B1"/>
-              <w:left w:val="single" w:sz="4" w:space="0" w:color="9AA5B1"/>
-              <w:bottom w:val="single" w:sz="4" w:space="0" w:color="9AA5B1"/>
-              <w:right w:val="single" w:sz="4" w:space="0" w:color="9AA5B1"/>
+              <w:top w:val="single" w:color="9AA5B1" w:sz="4" w:space="0"/>
+              <w:left w:val="single" w:color="9AA5B1" w:sz="4" w:space="0"/>
+              <w:bottom w:val="single" w:color="9AA5B1" w:sz="4" w:space="0"/>
+              <w:right w:val="single" w:color="9AA5B1" w:sz="4" w:space="0"/>
             </w:tcBorders>
             <w:tcMar>
               <w:top w:w="60" w:type="dxa"/>
@@ -3146,10 +3179,10 @@
           <w:tcPr>
             <w:tcW w:w="1400" w:type="dxa"/>
             <w:tcBorders>
-              <w:top w:val="single" w:sz="4" w:space="0" w:color="9AA5B1"/>
-              <w:left w:val="single" w:sz="4" w:space="0" w:color="9AA5B1"/>
-              <w:bottom w:val="single" w:sz="4" w:space="0" w:color="9AA5B1"/>
-              <w:right w:val="single" w:sz="4" w:space="0" w:color="9AA5B1"/>
+              <w:top w:val="single" w:color="9AA5B1" w:sz="4" w:space="0"/>
+              <w:left w:val="single" w:color="9AA5B1" w:sz="4" w:space="0"/>
+              <w:bottom w:val="single" w:color="9AA5B1" w:sz="4" w:space="0"/>
+              <w:right w:val="single" w:color="9AA5B1" w:sz="4" w:space="0"/>
             </w:tcBorders>
             <w:tcMar>
               <w:top w:w="60" w:type="dxa"/>
@@ -3165,10 +3198,10 @@
           <w:tcPr>
             <w:tcW w:w="1300" w:type="dxa"/>
             <w:tcBorders>
-              <w:top w:val="single" w:sz="4" w:space="0" w:color="9AA5B1"/>
-              <w:left w:val="single" w:sz="4" w:space="0" w:color="9AA5B1"/>
-              <w:bottom w:val="single" w:sz="4" w:space="0" w:color="9AA5B1"/>
-              <w:right w:val="single" w:sz="4" w:space="0" w:color="9AA5B1"/>
+              <w:top w:val="single" w:color="9AA5B1" w:sz="4" w:space="0"/>
+              <w:left w:val="single" w:color="9AA5B1" w:sz="4" w:space="0"/>
+              <w:bottom w:val="single" w:color="9AA5B1" w:sz="4" w:space="0"/>
+              <w:right w:val="single" w:color="9AA5B1" w:sz="4" w:space="0"/>
             </w:tcBorders>
             <w:tcMar>
               <w:top w:w="60" w:type="dxa"/>
@@ -3189,10 +3222,10 @@
           <w:tcPr>
             <w:tcW w:w="2100" w:type="dxa"/>
             <w:tcBorders>
-              <w:top w:val="single" w:sz="4" w:space="0" w:color="9AA5B1"/>
-              <w:left w:val="single" w:sz="4" w:space="0" w:color="9AA5B1"/>
-              <w:bottom w:val="single" w:sz="4" w:space="0" w:color="9AA5B1"/>
-              <w:right w:val="single" w:sz="4" w:space="0" w:color="9AA5B1"/>
+              <w:top w:val="single" w:color="9AA5B1" w:sz="4" w:space="0"/>
+              <w:left w:val="single" w:color="9AA5B1" w:sz="4" w:space="0"/>
+              <w:bottom w:val="single" w:color="9AA5B1" w:sz="4" w:space="0"/>
+              <w:right w:val="single" w:color="9AA5B1" w:sz="4" w:space="0"/>
             </w:tcBorders>
             <w:tcMar>
               <w:top w:w="60" w:type="dxa"/>
@@ -3208,10 +3241,10 @@
           <w:tcPr>
             <w:tcW w:w="4560" w:type="dxa"/>
             <w:tcBorders>
-              <w:top w:val="single" w:sz="4" w:space="0" w:color="9AA5B1"/>
-              <w:left w:val="single" w:sz="4" w:space="0" w:color="9AA5B1"/>
-              <w:bottom w:val="single" w:sz="4" w:space="0" w:color="9AA5B1"/>
-              <w:right w:val="single" w:sz="4" w:space="0" w:color="9AA5B1"/>
+              <w:top w:val="single" w:color="9AA5B1" w:sz="4" w:space="0"/>
+              <w:left w:val="single" w:color="9AA5B1" w:sz="4" w:space="0"/>
+              <w:bottom w:val="single" w:color="9AA5B1" w:sz="4" w:space="0"/>
+              <w:right w:val="single" w:color="9AA5B1" w:sz="4" w:space="0"/>
             </w:tcBorders>
             <w:tcMar>
               <w:top w:w="60" w:type="dxa"/>
@@ -3227,10 +3260,10 @@
           <w:tcPr>
             <w:tcW w:w="1400" w:type="dxa"/>
             <w:tcBorders>
-              <w:top w:val="single" w:sz="4" w:space="0" w:color="9AA5B1"/>
-              <w:left w:val="single" w:sz="4" w:space="0" w:color="9AA5B1"/>
-              <w:bottom w:val="single" w:sz="4" w:space="0" w:color="9AA5B1"/>
-              <w:right w:val="single" w:sz="4" w:space="0" w:color="9AA5B1"/>
+              <w:top w:val="single" w:color="9AA5B1" w:sz="4" w:space="0"/>
+              <w:left w:val="single" w:color="9AA5B1" w:sz="4" w:space="0"/>
+              <w:bottom w:val="single" w:color="9AA5B1" w:sz="4" w:space="0"/>
+              <w:right w:val="single" w:color="9AA5B1" w:sz="4" w:space="0"/>
             </w:tcBorders>
             <w:tcMar>
               <w:top w:w="60" w:type="dxa"/>
@@ -3246,10 +3279,10 @@
           <w:tcPr>
             <w:tcW w:w="1300" w:type="dxa"/>
             <w:tcBorders>
-              <w:top w:val="single" w:sz="4" w:space="0" w:color="9AA5B1"/>
-              <w:left w:val="single" w:sz="4" w:space="0" w:color="9AA5B1"/>
-              <w:bottom w:val="single" w:sz="4" w:space="0" w:color="9AA5B1"/>
-              <w:right w:val="single" w:sz="4" w:space="0" w:color="9AA5B1"/>
+              <w:top w:val="single" w:color="9AA5B1" w:sz="4" w:space="0"/>
+              <w:left w:val="single" w:color="9AA5B1" w:sz="4" w:space="0"/>
+              <w:bottom w:val="single" w:color="9AA5B1" w:sz="4" w:space="0"/>
+              <w:right w:val="single" w:color="9AA5B1" w:sz="4" w:space="0"/>
             </w:tcBorders>
             <w:tcMar>
               <w:top w:w="60" w:type="dxa"/>
@@ -3272,12 +3305,12 @@
       <w:tblPr>
         <w:tblW w:w="9360" w:type="dxa"/>
         <w:tblBorders>
-          <w:top w:val="single" w:sz="4" w:space="0" w:color="auto"/>
-          <w:left w:val="single" w:sz="4" w:space="0" w:color="auto"/>
-          <w:bottom w:val="single" w:sz="4" w:space="0" w:color="auto"/>
-          <w:right w:val="single" w:sz="4" w:space="0" w:color="auto"/>
-          <w:insideH w:val="single" w:sz="4" w:space="0" w:color="auto"/>
-          <w:insideV w:val="single" w:sz="4" w:space="0" w:color="auto"/>
+          <w:top w:val="single" w:color="auto" w:sz="4" w:space="0"/>
+          <w:left w:val="single" w:color="auto" w:sz="4" w:space="0"/>
+          <w:bottom w:val="single" w:color="auto" w:sz="4" w:space="0"/>
+          <w:right w:val="single" w:color="auto" w:sz="4" w:space="0"/>
+          <w:insideH w:val="single" w:color="auto" w:sz="4" w:space="0"/>
+          <w:insideV w:val="single" w:color="auto" w:sz="4" w:space="0"/>
         </w:tblBorders>
         <w:tblCellMar>
           <w:left w:w="10" w:type="dxa"/>
@@ -3293,10 +3326,10 @@
           <w:tcPr>
             <w:tcW w:w="9360" w:type="dxa"/>
             <w:tcBorders>
-              <w:top w:val="none" w:sz="0" w:space="0" w:color="FFFFFF"/>
-              <w:left w:val="none" w:sz="0" w:space="0" w:color="FFFFFF"/>
-              <w:bottom w:val="none" w:sz="0" w:space="0" w:color="FFFFFF"/>
-              <w:right w:val="none" w:sz="0" w:space="0" w:color="FFFFFF"/>
+              <w:top w:val="none" w:color="FFFFFF" w:sz="0" w:space="0"/>
+              <w:left w:val="none" w:color="FFFFFF" w:sz="0" w:space="0"/>
+              <w:bottom w:val="none" w:color="FFFFFF" w:sz="0" w:space="0"/>
+              <w:right w:val="none" w:color="FFFFFF" w:sz="0" w:space="0"/>
             </w:tcBorders>
             <w:shd w:val="clear" w:color="auto" w:fill="0051BA"/>
             <w:tcMar>
@@ -3340,12 +3373,12 @@
       <w:tblPr>
         <w:tblW w:w="9360" w:type="dxa"/>
         <w:tblBorders>
-          <w:top w:val="single" w:sz="4" w:space="0" w:color="auto"/>
-          <w:left w:val="single" w:sz="4" w:space="0" w:color="auto"/>
-          <w:bottom w:val="single" w:sz="4" w:space="0" w:color="auto"/>
-          <w:right w:val="single" w:sz="4" w:space="0" w:color="auto"/>
-          <w:insideH w:val="single" w:sz="4" w:space="0" w:color="auto"/>
-          <w:insideV w:val="single" w:sz="4" w:space="0" w:color="auto"/>
+          <w:top w:val="single" w:color="auto" w:sz="4" w:space="0"/>
+          <w:left w:val="single" w:color="auto" w:sz="4" w:space="0"/>
+          <w:bottom w:val="single" w:color="auto" w:sz="4" w:space="0"/>
+          <w:right w:val="single" w:color="auto" w:sz="4" w:space="0"/>
+          <w:insideH w:val="single" w:color="auto" w:sz="4" w:space="0"/>
+          <w:insideV w:val="single" w:color="auto" w:sz="4" w:space="0"/>
         </w:tblBorders>
         <w:tblCellMar>
           <w:left w:w="10" w:type="dxa"/>
@@ -3366,10 +3399,10 @@
           <w:tcPr>
             <w:tcW w:w="2340" w:type="dxa"/>
             <w:tcBorders>
-              <w:top w:val="single" w:sz="4" w:space="0" w:color="9AA5B1"/>
-              <w:left w:val="single" w:sz="4" w:space="0" w:color="9AA5B1"/>
-              <w:bottom w:val="single" w:sz="4" w:space="0" w:color="9AA5B1"/>
-              <w:right w:val="single" w:sz="4" w:space="0" w:color="9AA5B1"/>
+              <w:top w:val="single" w:color="9AA5B1" w:sz="4" w:space="0"/>
+              <w:left w:val="single" w:color="9AA5B1" w:sz="4" w:space="0"/>
+              <w:bottom w:val="single" w:color="9AA5B1" w:sz="4" w:space="0"/>
+              <w:right w:val="single" w:color="9AA5B1" w:sz="4" w:space="0"/>
             </w:tcBorders>
             <w:shd w:val="clear" w:color="auto" w:fill="0051BA"/>
             <w:tcMar>
@@ -3397,10 +3430,10 @@
           <w:tcPr>
             <w:tcW w:w="4680" w:type="dxa"/>
             <w:tcBorders>
-              <w:top w:val="single" w:sz="4" w:space="0" w:color="9AA5B1"/>
-              <w:left w:val="single" w:sz="4" w:space="0" w:color="9AA5B1"/>
-              <w:bottom w:val="single" w:sz="4" w:space="0" w:color="9AA5B1"/>
-              <w:right w:val="single" w:sz="4" w:space="0" w:color="9AA5B1"/>
+              <w:top w:val="single" w:color="9AA5B1" w:sz="4" w:space="0"/>
+              <w:left w:val="single" w:color="9AA5B1" w:sz="4" w:space="0"/>
+              <w:bottom w:val="single" w:color="9AA5B1" w:sz="4" w:space="0"/>
+              <w:right w:val="single" w:color="9AA5B1" w:sz="4" w:space="0"/>
             </w:tcBorders>
             <w:shd w:val="clear" w:color="auto" w:fill="0051BA"/>
             <w:tcMar>
@@ -3428,10 +3461,10 @@
           <w:tcPr>
             <w:tcW w:w="2340" w:type="dxa"/>
             <w:tcBorders>
-              <w:top w:val="single" w:sz="4" w:space="0" w:color="9AA5B1"/>
-              <w:left w:val="single" w:sz="4" w:space="0" w:color="9AA5B1"/>
-              <w:bottom w:val="single" w:sz="4" w:space="0" w:color="9AA5B1"/>
-              <w:right w:val="single" w:sz="4" w:space="0" w:color="9AA5B1"/>
+              <w:top w:val="single" w:color="9AA5B1" w:sz="4" w:space="0"/>
+              <w:left w:val="single" w:color="9AA5B1" w:sz="4" w:space="0"/>
+              <w:bottom w:val="single" w:color="9AA5B1" w:sz="4" w:space="0"/>
+              <w:right w:val="single" w:color="9AA5B1" w:sz="4" w:space="0"/>
             </w:tcBorders>
             <w:shd w:val="clear" w:color="auto" w:fill="0051BA"/>
             <w:tcMar>
@@ -3464,10 +3497,10 @@
           <w:tcPr>
             <w:tcW w:w="2340" w:type="dxa"/>
             <w:tcBorders>
-              <w:top w:val="single" w:sz="4" w:space="0" w:color="9AA5B1"/>
-              <w:left w:val="single" w:sz="4" w:space="0" w:color="9AA5B1"/>
-              <w:bottom w:val="single" w:sz="4" w:space="0" w:color="9AA5B1"/>
-              <w:right w:val="single" w:sz="4" w:space="0" w:color="9AA5B1"/>
+              <w:top w:val="single" w:color="9AA5B1" w:sz="4" w:space="0"/>
+              <w:left w:val="single" w:color="9AA5B1" w:sz="4" w:space="0"/>
+              <w:bottom w:val="single" w:color="9AA5B1" w:sz="4" w:space="0"/>
+              <w:right w:val="single" w:color="9AA5B1" w:sz="4" w:space="0"/>
             </w:tcBorders>
             <w:tcMar>
               <w:top w:w="60" w:type="dxa"/>
@@ -3483,10 +3516,10 @@
           <w:tcPr>
             <w:tcW w:w="4680" w:type="dxa"/>
             <w:tcBorders>
-              <w:top w:val="single" w:sz="4" w:space="0" w:color="9AA5B1"/>
-              <w:left w:val="single" w:sz="4" w:space="0" w:color="9AA5B1"/>
-              <w:bottom w:val="single" w:sz="4" w:space="0" w:color="9AA5B1"/>
-              <w:right w:val="single" w:sz="4" w:space="0" w:color="9AA5B1"/>
+              <w:top w:val="single" w:color="9AA5B1" w:sz="4" w:space="0"/>
+              <w:left w:val="single" w:color="9AA5B1" w:sz="4" w:space="0"/>
+              <w:bottom w:val="single" w:color="9AA5B1" w:sz="4" w:space="0"/>
+              <w:right w:val="single" w:color="9AA5B1" w:sz="4" w:space="0"/>
             </w:tcBorders>
             <w:tcMar>
               <w:top w:w="60" w:type="dxa"/>
@@ -3502,10 +3535,10 @@
           <w:tcPr>
             <w:tcW w:w="2340" w:type="dxa"/>
             <w:tcBorders>
-              <w:top w:val="single" w:sz="4" w:space="0" w:color="9AA5B1"/>
-              <w:left w:val="single" w:sz="4" w:space="0" w:color="9AA5B1"/>
-              <w:bottom w:val="single" w:sz="4" w:space="0" w:color="9AA5B1"/>
-              <w:right w:val="single" w:sz="4" w:space="0" w:color="9AA5B1"/>
+              <w:top w:val="single" w:color="9AA5B1" w:sz="4" w:space="0"/>
+              <w:left w:val="single" w:color="9AA5B1" w:sz="4" w:space="0"/>
+              <w:bottom w:val="single" w:color="9AA5B1" w:sz="4" w:space="0"/>
+              <w:right w:val="single" w:color="9AA5B1" w:sz="4" w:space="0"/>
             </w:tcBorders>
             <w:tcMar>
               <w:top w:w="60" w:type="dxa"/>
@@ -3526,10 +3559,10 @@
           <w:tcPr>
             <w:tcW w:w="2340" w:type="dxa"/>
             <w:tcBorders>
-              <w:top w:val="single" w:sz="4" w:space="0" w:color="9AA5B1"/>
-              <w:left w:val="single" w:sz="4" w:space="0" w:color="9AA5B1"/>
-              <w:bottom w:val="single" w:sz="4" w:space="0" w:color="9AA5B1"/>
-              <w:right w:val="single" w:sz="4" w:space="0" w:color="9AA5B1"/>
+              <w:top w:val="single" w:color="9AA5B1" w:sz="4" w:space="0"/>
+              <w:left w:val="single" w:color="9AA5B1" w:sz="4" w:space="0"/>
+              <w:bottom w:val="single" w:color="9AA5B1" w:sz="4" w:space="0"/>
+              <w:right w:val="single" w:color="9AA5B1" w:sz="4" w:space="0"/>
             </w:tcBorders>
             <w:tcMar>
               <w:top w:w="60" w:type="dxa"/>
@@ -3545,10 +3578,10 @@
           <w:tcPr>
             <w:tcW w:w="4680" w:type="dxa"/>
             <w:tcBorders>
-              <w:top w:val="single" w:sz="4" w:space="0" w:color="9AA5B1"/>
-              <w:left w:val="single" w:sz="4" w:space="0" w:color="9AA5B1"/>
-              <w:bottom w:val="single" w:sz="4" w:space="0" w:color="9AA5B1"/>
-              <w:right w:val="single" w:sz="4" w:space="0" w:color="9AA5B1"/>
+              <w:top w:val="single" w:color="9AA5B1" w:sz="4" w:space="0"/>
+              <w:left w:val="single" w:color="9AA5B1" w:sz="4" w:space="0"/>
+              <w:bottom w:val="single" w:color="9AA5B1" w:sz="4" w:space="0"/>
+              <w:right w:val="single" w:color="9AA5B1" w:sz="4" w:space="0"/>
             </w:tcBorders>
             <w:tcMar>
               <w:top w:w="60" w:type="dxa"/>
@@ -3564,10 +3597,10 @@
           <w:tcPr>
             <w:tcW w:w="2340" w:type="dxa"/>
             <w:tcBorders>
-              <w:top w:val="single" w:sz="4" w:space="0" w:color="9AA5B1"/>
-              <w:left w:val="single" w:sz="4" w:space="0" w:color="9AA5B1"/>
-              <w:bottom w:val="single" w:sz="4" w:space="0" w:color="9AA5B1"/>
-              <w:right w:val="single" w:sz="4" w:space="0" w:color="9AA5B1"/>
+              <w:top w:val="single" w:color="9AA5B1" w:sz="4" w:space="0"/>
+              <w:left w:val="single" w:color="9AA5B1" w:sz="4" w:space="0"/>
+              <w:bottom w:val="single" w:color="9AA5B1" w:sz="4" w:space="0"/>
+              <w:right w:val="single" w:color="9AA5B1" w:sz="4" w:space="0"/>
             </w:tcBorders>
             <w:tcMar>
               <w:top w:w="60" w:type="dxa"/>
@@ -3588,10 +3621,10 @@
           <w:tcPr>
             <w:tcW w:w="2340" w:type="dxa"/>
             <w:tcBorders>
-              <w:top w:val="single" w:sz="4" w:space="0" w:color="9AA5B1"/>
-              <w:left w:val="single" w:sz="4" w:space="0" w:color="9AA5B1"/>
-              <w:bottom w:val="single" w:sz="4" w:space="0" w:color="9AA5B1"/>
-              <w:right w:val="single" w:sz="4" w:space="0" w:color="9AA5B1"/>
+              <w:top w:val="single" w:color="9AA5B1" w:sz="4" w:space="0"/>
+              <w:left w:val="single" w:color="9AA5B1" w:sz="4" w:space="0"/>
+              <w:bottom w:val="single" w:color="9AA5B1" w:sz="4" w:space="0"/>
+              <w:right w:val="single" w:color="9AA5B1" w:sz="4" w:space="0"/>
             </w:tcBorders>
             <w:tcMar>
               <w:top w:w="60" w:type="dxa"/>
@@ -3607,10 +3640,10 @@
           <w:tcPr>
             <w:tcW w:w="4680" w:type="dxa"/>
             <w:tcBorders>
-              <w:top w:val="single" w:sz="4" w:space="0" w:color="9AA5B1"/>
-              <w:left w:val="single" w:sz="4" w:space="0" w:color="9AA5B1"/>
-              <w:bottom w:val="single" w:sz="4" w:space="0" w:color="9AA5B1"/>
-              <w:right w:val="single" w:sz="4" w:space="0" w:color="9AA5B1"/>
+              <w:top w:val="single" w:color="9AA5B1" w:sz="4" w:space="0"/>
+              <w:left w:val="single" w:color="9AA5B1" w:sz="4" w:space="0"/>
+              <w:bottom w:val="single" w:color="9AA5B1" w:sz="4" w:space="0"/>
+              <w:right w:val="single" w:color="9AA5B1" w:sz="4" w:space="0"/>
             </w:tcBorders>
             <w:tcMar>
               <w:top w:w="60" w:type="dxa"/>
@@ -3626,10 +3659,10 @@
           <w:tcPr>
             <w:tcW w:w="2340" w:type="dxa"/>
             <w:tcBorders>
-              <w:top w:val="single" w:sz="4" w:space="0" w:color="9AA5B1"/>
-              <w:left w:val="single" w:sz="4" w:space="0" w:color="9AA5B1"/>
-              <w:bottom w:val="single" w:sz="4" w:space="0" w:color="9AA5B1"/>
-              <w:right w:val="single" w:sz="4" w:space="0" w:color="9AA5B1"/>
+              <w:top w:val="single" w:color="9AA5B1" w:sz="4" w:space="0"/>
+              <w:left w:val="single" w:color="9AA5B1" w:sz="4" w:space="0"/>
+              <w:bottom w:val="single" w:color="9AA5B1" w:sz="4" w:space="0"/>
+              <w:right w:val="single" w:color="9AA5B1" w:sz="4" w:space="0"/>
             </w:tcBorders>
             <w:tcMar>
               <w:top w:w="60" w:type="dxa"/>
@@ -3650,10 +3683,10 @@
           <w:tcPr>
             <w:tcW w:w="2340" w:type="dxa"/>
             <w:tcBorders>
-              <w:top w:val="single" w:sz="4" w:space="0" w:color="9AA5B1"/>
-              <w:left w:val="single" w:sz="4" w:space="0" w:color="9AA5B1"/>
-              <w:bottom w:val="single" w:sz="4" w:space="0" w:color="9AA5B1"/>
-              <w:right w:val="single" w:sz="4" w:space="0" w:color="9AA5B1"/>
+              <w:top w:val="single" w:color="9AA5B1" w:sz="4" w:space="0"/>
+              <w:left w:val="single" w:color="9AA5B1" w:sz="4" w:space="0"/>
+              <w:bottom w:val="single" w:color="9AA5B1" w:sz="4" w:space="0"/>
+              <w:right w:val="single" w:color="9AA5B1" w:sz="4" w:space="0"/>
             </w:tcBorders>
             <w:tcMar>
               <w:top w:w="60" w:type="dxa"/>
@@ -3669,10 +3702,10 @@
           <w:tcPr>
             <w:tcW w:w="4680" w:type="dxa"/>
             <w:tcBorders>
-              <w:top w:val="single" w:sz="4" w:space="0" w:color="9AA5B1"/>
-              <w:left w:val="single" w:sz="4" w:space="0" w:color="9AA5B1"/>
-              <w:bottom w:val="single" w:sz="4" w:space="0" w:color="9AA5B1"/>
-              <w:right w:val="single" w:sz="4" w:space="0" w:color="9AA5B1"/>
+              <w:top w:val="single" w:color="9AA5B1" w:sz="4" w:space="0"/>
+              <w:left w:val="single" w:color="9AA5B1" w:sz="4" w:space="0"/>
+              <w:bottom w:val="single" w:color="9AA5B1" w:sz="4" w:space="0"/>
+              <w:right w:val="single" w:color="9AA5B1" w:sz="4" w:space="0"/>
             </w:tcBorders>
             <w:tcMar>
               <w:top w:w="60" w:type="dxa"/>
@@ -3688,10 +3721,10 @@
           <w:tcPr>
             <w:tcW w:w="2340" w:type="dxa"/>
             <w:tcBorders>
-              <w:top w:val="single" w:sz="4" w:space="0" w:color="9AA5B1"/>
-              <w:left w:val="single" w:sz="4" w:space="0" w:color="9AA5B1"/>
-              <w:bottom w:val="single" w:sz="4" w:space="0" w:color="9AA5B1"/>
-              <w:right w:val="single" w:sz="4" w:space="0" w:color="9AA5B1"/>
+              <w:top w:val="single" w:color="9AA5B1" w:sz="4" w:space="0"/>
+              <w:left w:val="single" w:color="9AA5B1" w:sz="4" w:space="0"/>
+              <w:bottom w:val="single" w:color="9AA5B1" w:sz="4" w:space="0"/>
+              <w:right w:val="single" w:color="9AA5B1" w:sz="4" w:space="0"/>
             </w:tcBorders>
             <w:tcMar>
               <w:top w:w="60" w:type="dxa"/>
@@ -3712,10 +3745,10 @@
           <w:tcPr>
             <w:tcW w:w="2340" w:type="dxa"/>
             <w:tcBorders>
-              <w:top w:val="single" w:sz="4" w:space="0" w:color="9AA5B1"/>
-              <w:left w:val="single" w:sz="4" w:space="0" w:color="9AA5B1"/>
-              <w:bottom w:val="single" w:sz="4" w:space="0" w:color="9AA5B1"/>
-              <w:right w:val="single" w:sz="4" w:space="0" w:color="9AA5B1"/>
+              <w:top w:val="single" w:color="9AA5B1" w:sz="4" w:space="0"/>
+              <w:left w:val="single" w:color="9AA5B1" w:sz="4" w:space="0"/>
+              <w:bottom w:val="single" w:color="9AA5B1" w:sz="4" w:space="0"/>
+              <w:right w:val="single" w:color="9AA5B1" w:sz="4" w:space="0"/>
             </w:tcBorders>
             <w:tcMar>
               <w:top w:w="60" w:type="dxa"/>
@@ -3731,10 +3764,10 @@
           <w:tcPr>
             <w:tcW w:w="4680" w:type="dxa"/>
             <w:tcBorders>
-              <w:top w:val="single" w:sz="4" w:space="0" w:color="9AA5B1"/>
-              <w:left w:val="single" w:sz="4" w:space="0" w:color="9AA5B1"/>
-              <w:bottom w:val="single" w:sz="4" w:space="0" w:color="9AA5B1"/>
-              <w:right w:val="single" w:sz="4" w:space="0" w:color="9AA5B1"/>
+              <w:top w:val="single" w:color="9AA5B1" w:sz="4" w:space="0"/>
+              <w:left w:val="single" w:color="9AA5B1" w:sz="4" w:space="0"/>
+              <w:bottom w:val="single" w:color="9AA5B1" w:sz="4" w:space="0"/>
+              <w:right w:val="single" w:color="9AA5B1" w:sz="4" w:space="0"/>
             </w:tcBorders>
             <w:tcMar>
               <w:top w:w="60" w:type="dxa"/>
@@ -3750,10 +3783,10 @@
           <w:tcPr>
             <w:tcW w:w="2340" w:type="dxa"/>
             <w:tcBorders>
-              <w:top w:val="single" w:sz="4" w:space="0" w:color="9AA5B1"/>
-              <w:left w:val="single" w:sz="4" w:space="0" w:color="9AA5B1"/>
-              <w:bottom w:val="single" w:sz="4" w:space="0" w:color="9AA5B1"/>
-              <w:right w:val="single" w:sz="4" w:space="0" w:color="9AA5B1"/>
+              <w:top w:val="single" w:color="9AA5B1" w:sz="4" w:space="0"/>
+              <w:left w:val="single" w:color="9AA5B1" w:sz="4" w:space="0"/>
+              <w:bottom w:val="single" w:color="9AA5B1" w:sz="4" w:space="0"/>
+              <w:right w:val="single" w:color="9AA5B1" w:sz="4" w:space="0"/>
             </w:tcBorders>
             <w:tcMar>
               <w:top w:w="60" w:type="dxa"/>
@@ -3774,10 +3807,10 @@
           <w:tcPr>
             <w:tcW w:w="2340" w:type="dxa"/>
             <w:tcBorders>
-              <w:top w:val="single" w:sz="4" w:space="0" w:color="9AA5B1"/>
-              <w:left w:val="single" w:sz="4" w:space="0" w:color="9AA5B1"/>
-              <w:bottom w:val="single" w:sz="4" w:space="0" w:color="9AA5B1"/>
-              <w:right w:val="single" w:sz="4" w:space="0" w:color="9AA5B1"/>
+              <w:top w:val="single" w:color="9AA5B1" w:sz="4" w:space="0"/>
+              <w:left w:val="single" w:color="9AA5B1" w:sz="4" w:space="0"/>
+              <w:bottom w:val="single" w:color="9AA5B1" w:sz="4" w:space="0"/>
+              <w:right w:val="single" w:color="9AA5B1" w:sz="4" w:space="0"/>
             </w:tcBorders>
             <w:tcMar>
               <w:top w:w="60" w:type="dxa"/>
@@ -3793,10 +3826,10 @@
           <w:tcPr>
             <w:tcW w:w="4680" w:type="dxa"/>
             <w:tcBorders>
-              <w:top w:val="single" w:sz="4" w:space="0" w:color="9AA5B1"/>
-              <w:left w:val="single" w:sz="4" w:space="0" w:color="9AA5B1"/>
-              <w:bottom w:val="single" w:sz="4" w:space="0" w:color="9AA5B1"/>
-              <w:right w:val="single" w:sz="4" w:space="0" w:color="9AA5B1"/>
+              <w:top w:val="single" w:color="9AA5B1" w:sz="4" w:space="0"/>
+              <w:left w:val="single" w:color="9AA5B1" w:sz="4" w:space="0"/>
+              <w:bottom w:val="single" w:color="9AA5B1" w:sz="4" w:space="0"/>
+              <w:right w:val="single" w:color="9AA5B1" w:sz="4" w:space="0"/>
             </w:tcBorders>
             <w:tcMar>
               <w:top w:w="60" w:type="dxa"/>
@@ -3812,10 +3845,10 @@
           <w:tcPr>
             <w:tcW w:w="2340" w:type="dxa"/>
             <w:tcBorders>
-              <w:top w:val="single" w:sz="4" w:space="0" w:color="9AA5B1"/>
-              <w:left w:val="single" w:sz="4" w:space="0" w:color="9AA5B1"/>
-              <w:bottom w:val="single" w:sz="4" w:space="0" w:color="9AA5B1"/>
-              <w:right w:val="single" w:sz="4" w:space="0" w:color="9AA5B1"/>
+              <w:top w:val="single" w:color="9AA5B1" w:sz="4" w:space="0"/>
+              <w:left w:val="single" w:color="9AA5B1" w:sz="4" w:space="0"/>
+              <w:bottom w:val="single" w:color="9AA5B1" w:sz="4" w:space="0"/>
+              <w:right w:val="single" w:color="9AA5B1" w:sz="4" w:space="0"/>
             </w:tcBorders>
             <w:tcMar>
               <w:top w:w="60" w:type="dxa"/>
@@ -3836,10 +3869,10 @@
           <w:tcPr>
             <w:tcW w:w="2340" w:type="dxa"/>
             <w:tcBorders>
-              <w:top w:val="single" w:sz="4" w:space="0" w:color="9AA5B1"/>
-              <w:left w:val="single" w:sz="4" w:space="0" w:color="9AA5B1"/>
-              <w:bottom w:val="single" w:sz="4" w:space="0" w:color="9AA5B1"/>
-              <w:right w:val="single" w:sz="4" w:space="0" w:color="9AA5B1"/>
+              <w:top w:val="single" w:color="9AA5B1" w:sz="4" w:space="0"/>
+              <w:left w:val="single" w:color="9AA5B1" w:sz="4" w:space="0"/>
+              <w:bottom w:val="single" w:color="9AA5B1" w:sz="4" w:space="0"/>
+              <w:right w:val="single" w:color="9AA5B1" w:sz="4" w:space="0"/>
             </w:tcBorders>
             <w:tcMar>
               <w:top w:w="60" w:type="dxa"/>
@@ -3855,10 +3888,10 @@
           <w:tcPr>
             <w:tcW w:w="4680" w:type="dxa"/>
             <w:tcBorders>
-              <w:top w:val="single" w:sz="4" w:space="0" w:color="9AA5B1"/>
-              <w:left w:val="single" w:sz="4" w:space="0" w:color="9AA5B1"/>
-              <w:bottom w:val="single" w:sz="4" w:space="0" w:color="9AA5B1"/>
-              <w:right w:val="single" w:sz="4" w:space="0" w:color="9AA5B1"/>
+              <w:top w:val="single" w:color="9AA5B1" w:sz="4" w:space="0"/>
+              <w:left w:val="single" w:color="9AA5B1" w:sz="4" w:space="0"/>
+              <w:bottom w:val="single" w:color="9AA5B1" w:sz="4" w:space="0"/>
+              <w:right w:val="single" w:color="9AA5B1" w:sz="4" w:space="0"/>
             </w:tcBorders>
             <w:tcMar>
               <w:top w:w="60" w:type="dxa"/>
@@ -3874,10 +3907,10 @@
           <w:tcPr>
             <w:tcW w:w="2340" w:type="dxa"/>
             <w:tcBorders>
-              <w:top w:val="single" w:sz="4" w:space="0" w:color="9AA5B1"/>
-              <w:left w:val="single" w:sz="4" w:space="0" w:color="9AA5B1"/>
-              <w:bottom w:val="single" w:sz="4" w:space="0" w:color="9AA5B1"/>
-              <w:right w:val="single" w:sz="4" w:space="0" w:color="9AA5B1"/>
+              <w:top w:val="single" w:color="9AA5B1" w:sz="4" w:space="0"/>
+              <w:left w:val="single" w:color="9AA5B1" w:sz="4" w:space="0"/>
+              <w:bottom w:val="single" w:color="9AA5B1" w:sz="4" w:space="0"/>
+              <w:right w:val="single" w:color="9AA5B1" w:sz="4" w:space="0"/>
             </w:tcBorders>
             <w:tcMar>
               <w:top w:w="60" w:type="dxa"/>
@@ -3898,10 +3931,10 @@
           <w:tcPr>
             <w:tcW w:w="2340" w:type="dxa"/>
             <w:tcBorders>
-              <w:top w:val="single" w:sz="4" w:space="0" w:color="9AA5B1"/>
-              <w:left w:val="single" w:sz="4" w:space="0" w:color="9AA5B1"/>
-              <w:bottom w:val="single" w:sz="4" w:space="0" w:color="9AA5B1"/>
-              <w:right w:val="single" w:sz="4" w:space="0" w:color="9AA5B1"/>
+              <w:top w:val="single" w:color="9AA5B1" w:sz="4" w:space="0"/>
+              <w:left w:val="single" w:color="9AA5B1" w:sz="4" w:space="0"/>
+              <w:bottom w:val="single" w:color="9AA5B1" w:sz="4" w:space="0"/>
+              <w:right w:val="single" w:color="9AA5B1" w:sz="4" w:space="0"/>
             </w:tcBorders>
             <w:tcMar>
               <w:top w:w="60" w:type="dxa"/>
@@ -3917,10 +3950,10 @@
           <w:tcPr>
             <w:tcW w:w="4680" w:type="dxa"/>
             <w:tcBorders>
-              <w:top w:val="single" w:sz="4" w:space="0" w:color="9AA5B1"/>
-              <w:left w:val="single" w:sz="4" w:space="0" w:color="9AA5B1"/>
-              <w:bottom w:val="single" w:sz="4" w:space="0" w:color="9AA5B1"/>
-              <w:right w:val="single" w:sz="4" w:space="0" w:color="9AA5B1"/>
+              <w:top w:val="single" w:color="9AA5B1" w:sz="4" w:space="0"/>
+              <w:left w:val="single" w:color="9AA5B1" w:sz="4" w:space="0"/>
+              <w:bottom w:val="single" w:color="9AA5B1" w:sz="4" w:space="0"/>
+              <w:right w:val="single" w:color="9AA5B1" w:sz="4" w:space="0"/>
             </w:tcBorders>
             <w:tcMar>
               <w:top w:w="60" w:type="dxa"/>
@@ -3936,10 +3969,10 @@
           <w:tcPr>
             <w:tcW w:w="2340" w:type="dxa"/>
             <w:tcBorders>
-              <w:top w:val="single" w:sz="4" w:space="0" w:color="9AA5B1"/>
-              <w:left w:val="single" w:sz="4" w:space="0" w:color="9AA5B1"/>
-              <w:bottom w:val="single" w:sz="4" w:space="0" w:color="9AA5B1"/>
-              <w:right w:val="single" w:sz="4" w:space="0" w:color="9AA5B1"/>
+              <w:top w:val="single" w:color="9AA5B1" w:sz="4" w:space="0"/>
+              <w:left w:val="single" w:color="9AA5B1" w:sz="4" w:space="0"/>
+              <w:bottom w:val="single" w:color="9AA5B1" w:sz="4" w:space="0"/>
+              <w:right w:val="single" w:color="9AA5B1" w:sz="4" w:space="0"/>
             </w:tcBorders>
             <w:tcMar>
               <w:top w:w="60" w:type="dxa"/>
@@ -3961,10 +3994,10 @@
             <w:tcW w:w="7020" w:type="dxa"/>
             <w:gridSpan w:val="2"/>
             <w:tcBorders>
-              <w:top w:val="single" w:sz="4" w:space="0" w:color="9AA5B1"/>
-              <w:left w:val="single" w:sz="4" w:space="0" w:color="9AA5B1"/>
-              <w:bottom w:val="single" w:sz="4" w:space="0" w:color="9AA5B1"/>
-              <w:right w:val="single" w:sz="4" w:space="0" w:color="9AA5B1"/>
+              <w:top w:val="single" w:color="9AA5B1" w:sz="4" w:space="0"/>
+              <w:left w:val="single" w:color="9AA5B1" w:sz="4" w:space="0"/>
+              <w:bottom w:val="single" w:color="9AA5B1" w:sz="4" w:space="0"/>
+              <w:right w:val="single" w:color="9AA5B1" w:sz="4" w:space="0"/>
             </w:tcBorders>
             <w:shd w:val="clear" w:color="auto" w:fill="E8EEF7"/>
             <w:tcMar>
@@ -4011,10 +4044,10 @@
           <w:tcPr>
             <w:tcW w:w="2340" w:type="dxa"/>
             <w:tcBorders>
-              <w:top w:val="single" w:sz="4" w:space="0" w:color="9AA5B1"/>
-              <w:left w:val="single" w:sz="4" w:space="0" w:color="9AA5B1"/>
-              <w:bottom w:val="single" w:sz="4" w:space="0" w:color="9AA5B1"/>
-              <w:right w:val="single" w:sz="4" w:space="0" w:color="9AA5B1"/>
+              <w:top w:val="single" w:color="9AA5B1" w:sz="4" w:space="0"/>
+              <w:left w:val="single" w:color="9AA5B1" w:sz="4" w:space="0"/>
+              <w:bottom w:val="single" w:color="9AA5B1" w:sz="4" w:space="0"/>
+              <w:right w:val="single" w:color="9AA5B1" w:sz="4" w:space="0"/>
             </w:tcBorders>
             <w:shd w:val="clear" w:color="auto" w:fill="F2F2F2"/>
             <w:tcMar>
@@ -4035,7 +4068,7 @@
       </w:pPr>
     </w:p>
     <w:sectPr>
-      <w:pgSz w:w="12240" w:h="15840"/>
+      <w:pgSz w:w="12240" w:h="15840" w:orient="portrait"/>
       <w:pgMar w:top="1080" w:right="1440" w:bottom="1080" w:left="1440" w:header="708" w:footer="708" w:gutter="0"/>
       <w:cols w:space="720"/>
       <w:docGrid w:linePitch="360"/>
@@ -4146,7 +4179,7 @@
   <w:docDefaults>
     <w:rPrDefault>
       <w:rPr>
-        <w:rFonts w:ascii="Calibri" w:eastAsia="Calibri" w:hAnsi="Calibri" w:cs="Calibri"/>
+        <w:rFonts w:ascii="Calibri" w:hAnsi="Calibri" w:eastAsia="Calibri" w:cs="Calibri"/>
         <w:lang w:val="en-US" w:eastAsia="zh-CN" w:bidi="ar-SA"/>
       </w:rPr>
     </w:rPrDefault>
@@ -4155,14 +4188,14 @@
   <w:latentStyles w:defLockedState="0" w:defUIPriority="99" w:defSemiHidden="0" w:defUnhideWhenUsed="0" w:defQFormat="0" w:count="376">
     <w:lsdException w:name="Normal" w:uiPriority="0" w:qFormat="1"/>
     <w:lsdException w:name="heading 1" w:uiPriority="9" w:qFormat="1"/>
-    <w:lsdException w:name="heading 2" w:semiHidden="1" w:uiPriority="9" w:unhideWhenUsed="1" w:qFormat="1"/>
-    <w:lsdException w:name="heading 3" w:semiHidden="1" w:uiPriority="9" w:unhideWhenUsed="1" w:qFormat="1"/>
-    <w:lsdException w:name="heading 4" w:semiHidden="1" w:uiPriority="9" w:unhideWhenUsed="1" w:qFormat="1"/>
-    <w:lsdException w:name="heading 5" w:semiHidden="1" w:uiPriority="9" w:unhideWhenUsed="1" w:qFormat="1"/>
-    <w:lsdException w:name="heading 6" w:semiHidden="1" w:uiPriority="9" w:unhideWhenUsed="1" w:qFormat="1"/>
-    <w:lsdException w:name="heading 7" w:semiHidden="1" w:uiPriority="9" w:unhideWhenUsed="1" w:qFormat="1"/>
-    <w:lsdException w:name="heading 8" w:semiHidden="1" w:uiPriority="9" w:unhideWhenUsed="1" w:qFormat="1"/>
-    <w:lsdException w:name="heading 9" w:semiHidden="1" w:uiPriority="9" w:unhideWhenUsed="1" w:qFormat="1"/>
+    <w:lsdException w:name="heading 2" w:uiPriority="9" w:semiHidden="1" w:unhideWhenUsed="1" w:qFormat="1"/>
+    <w:lsdException w:name="heading 3" w:uiPriority="9" w:semiHidden="1" w:unhideWhenUsed="1" w:qFormat="1"/>
+    <w:lsdException w:name="heading 4" w:uiPriority="9" w:semiHidden="1" w:unhideWhenUsed="1" w:qFormat="1"/>
+    <w:lsdException w:name="heading 5" w:uiPriority="9" w:semiHidden="1" w:unhideWhenUsed="1" w:qFormat="1"/>
+    <w:lsdException w:name="heading 6" w:uiPriority="9" w:semiHidden="1" w:unhideWhenUsed="1" w:qFormat="1"/>
+    <w:lsdException w:name="heading 7" w:uiPriority="9" w:semiHidden="1" w:unhideWhenUsed="1" w:qFormat="1"/>
+    <w:lsdException w:name="heading 8" w:uiPriority="9" w:semiHidden="1" w:unhideWhenUsed="1" w:qFormat="1"/>
+    <w:lsdException w:name="heading 9" w:uiPriority="9" w:semiHidden="1" w:unhideWhenUsed="1" w:qFormat="1"/>
     <w:lsdException w:name="index 1" w:semiHidden="1" w:unhideWhenUsed="1"/>
     <w:lsdException w:name="index 2" w:semiHidden="1" w:unhideWhenUsed="1"/>
     <w:lsdException w:name="index 3" w:semiHidden="1" w:unhideWhenUsed="1"/>
@@ -4172,22 +4205,22 @@
     <w:lsdException w:name="index 7" w:semiHidden="1" w:unhideWhenUsed="1"/>
     <w:lsdException w:name="index 8" w:semiHidden="1" w:unhideWhenUsed="1"/>
     <w:lsdException w:name="index 9" w:semiHidden="1" w:unhideWhenUsed="1"/>
-    <w:lsdException w:name="toc 1" w:semiHidden="1" w:uiPriority="39" w:unhideWhenUsed="1"/>
-    <w:lsdException w:name="toc 2" w:semiHidden="1" w:uiPriority="39" w:unhideWhenUsed="1"/>
-    <w:lsdException w:name="toc 3" w:semiHidden="1" w:uiPriority="39" w:unhideWhenUsed="1"/>
-    <w:lsdException w:name="toc 4" w:semiHidden="1" w:uiPriority="39" w:unhideWhenUsed="1"/>
-    <w:lsdException w:name="toc 5" w:semiHidden="1" w:uiPriority="39" w:unhideWhenUsed="1"/>
-    <w:lsdException w:name="toc 6" w:semiHidden="1" w:uiPriority="39" w:unhideWhenUsed="1"/>
-    <w:lsdException w:name="toc 7" w:semiHidden="1" w:uiPriority="39" w:unhideWhenUsed="1"/>
-    <w:lsdException w:name="toc 8" w:semiHidden="1" w:uiPriority="39" w:unhideWhenUsed="1"/>
-    <w:lsdException w:name="toc 9" w:semiHidden="1" w:uiPriority="39" w:unhideWhenUsed="1"/>
+    <w:lsdException w:name="toc 1" w:uiPriority="39" w:semiHidden="1" w:unhideWhenUsed="1"/>
+    <w:lsdException w:name="toc 2" w:uiPriority="39" w:semiHidden="1" w:unhideWhenUsed="1"/>
+    <w:lsdException w:name="toc 3" w:uiPriority="39" w:semiHidden="1" w:unhideWhenUsed="1"/>
+    <w:lsdException w:name="toc 4" w:uiPriority="39" w:semiHidden="1" w:unhideWhenUsed="1"/>
+    <w:lsdException w:name="toc 5" w:uiPriority="39" w:semiHidden="1" w:unhideWhenUsed="1"/>
+    <w:lsdException w:name="toc 6" w:uiPriority="39" w:semiHidden="1" w:unhideWhenUsed="1"/>
+    <w:lsdException w:name="toc 7" w:uiPriority="39" w:semiHidden="1" w:unhideWhenUsed="1"/>
+    <w:lsdException w:name="toc 8" w:uiPriority="39" w:semiHidden="1" w:unhideWhenUsed="1"/>
+    <w:lsdException w:name="toc 9" w:uiPriority="39" w:semiHidden="1" w:unhideWhenUsed="1"/>
     <w:lsdException w:name="Normal Indent" w:semiHidden="1" w:unhideWhenUsed="1"/>
     <w:lsdException w:name="footnote text" w:semiHidden="1" w:unhideWhenUsed="1"/>
     <w:lsdException w:name="annotation text" w:semiHidden="1" w:unhideWhenUsed="1"/>
     <w:lsdException w:name="header" w:semiHidden="1" w:unhideWhenUsed="1"/>
     <w:lsdException w:name="footer" w:semiHidden="1" w:unhideWhenUsed="1"/>
     <w:lsdException w:name="index heading" w:semiHidden="1" w:unhideWhenUsed="1"/>
-    <w:lsdException w:name="caption" w:semiHidden="1" w:uiPriority="35" w:unhideWhenUsed="1" w:qFormat="1"/>
+    <w:lsdException w:name="caption" w:uiPriority="35" w:semiHidden="1" w:unhideWhenUsed="1" w:qFormat="1"/>
     <w:lsdException w:name="table of figures" w:semiHidden="1" w:unhideWhenUsed="1"/>
     <w:lsdException w:name="envelope address" w:semiHidden="1" w:unhideWhenUsed="1"/>
     <w:lsdException w:name="envelope return" w:semiHidden="1" w:unhideWhenUsed="1"/>
@@ -4218,7 +4251,7 @@
     <w:lsdException w:name="Title" w:uiPriority="10" w:qFormat="1"/>
     <w:lsdException w:name="Closing" w:semiHidden="1" w:unhideWhenUsed="1"/>
     <w:lsdException w:name="Signature" w:semiHidden="1" w:unhideWhenUsed="1"/>
-    <w:lsdException w:name="Default Paragraph Font" w:semiHidden="1" w:uiPriority="1" w:unhideWhenUsed="1"/>
+    <w:lsdException w:name="Default Paragraph Font" w:uiPriority="1" w:semiHidden="1" w:unhideWhenUsed="1"/>
     <w:lsdException w:name="Body Text" w:semiHidden="1" w:unhideWhenUsed="1"/>
     <w:lsdException w:name="Body Text Indent" w:semiHidden="1" w:unhideWhenUsed="1"/>
     <w:lsdException w:name="List Continue" w:semiHidden="1" w:unhideWhenUsed="1"/>
@@ -4418,8 +4451,8 @@
     <w:lsdException w:name="Subtle Reference" w:uiPriority="31" w:qFormat="1"/>
     <w:lsdException w:name="Intense Reference" w:uiPriority="32" w:qFormat="1"/>
     <w:lsdException w:name="Book Title" w:uiPriority="33" w:qFormat="1"/>
-    <w:lsdException w:name="Bibliography" w:semiHidden="1" w:uiPriority="37" w:unhideWhenUsed="1"/>
-    <w:lsdException w:name="TOC Heading" w:semiHidden="1" w:uiPriority="39" w:unhideWhenUsed="1" w:qFormat="1"/>
+    <w:lsdException w:name="Bibliography" w:uiPriority="37" w:semiHidden="1" w:unhideWhenUsed="1"/>
+    <w:lsdException w:name="TOC Heading" w:uiPriority="39" w:semiHidden="1" w:unhideWhenUsed="1" w:qFormat="1"/>
     <w:lsdException w:name="Plain Table 1" w:uiPriority="41"/>
     <w:lsdException w:name="Plain Table 2" w:uiPriority="42"/>
     <w:lsdException w:name="Plain Table 3" w:uiPriority="43"/>
@@ -4530,7 +4563,7 @@
     <w:lsdException w:name="Unresolved Mention" w:semiHidden="1" w:unhideWhenUsed="1"/>
     <w:lsdException w:name="Smart Link" w:semiHidden="1" w:unhideWhenUsed="1"/>
   </w:latentStyles>
-  <w:style w:type="paragraph" w:default="1" w:styleId="Normal">
+  <w:style w:type="paragraph" w:styleId="Normal" w:default="1">
     <w:name w:val="Normal"/>
     <w:qFormat/>
   </w:style>
@@ -4618,13 +4651,13 @@
       <w:color w:val="1F4D78"/>
     </w:rPr>
   </w:style>
-  <w:style w:type="character" w:default="1" w:styleId="DefaultParagraphFont">
+  <w:style w:type="character" w:styleId="DefaultParagraphFont" w:default="1">
     <w:name w:val="Default Paragraph Font"/>
     <w:uiPriority w:val="1"/>
     <w:semiHidden/>
     <w:unhideWhenUsed/>
   </w:style>
-  <w:style w:type="table" w:default="1" w:styleId="TableNormal">
+  <w:style w:type="table" w:styleId="TableNormal" w:default="1">
     <w:name w:val="Normal Table"/>
     <w:uiPriority w:val="99"/>
     <w:semiHidden/>
@@ -4639,7 +4672,7 @@
       </w:tblCellMar>
     </w:tblPr>
   </w:style>
-  <w:style w:type="numbering" w:default="1" w:styleId="NoList">
+  <w:style w:type="numbering" w:styleId="NoList" w:default="1">
     <w:name w:val="No List"/>
     <w:uiPriority w:val="99"/>
     <w:semiHidden/>
@@ -4654,7 +4687,7 @@
       <w:szCs w:val="56"/>
     </w:rPr>
   </w:style>
-  <w:style w:type="paragraph" w:customStyle="1" w:styleId="Strong1">
+  <w:style w:type="paragraph" w:styleId="Strong1" w:customStyle="1">
     <w:name w:val="Strong1"/>
     <w:qFormat/>
     <w:rPr>
@@ -4691,7 +4724,7 @@
     <w:semiHidden/>
     <w:unhideWhenUsed/>
   </w:style>
-  <w:style w:type="character" w:customStyle="1" w:styleId="FootnoteTextChar">
+  <w:style w:type="character" w:styleId="FootnoteTextChar" w:customStyle="1">
     <w:name w:val="Footnote Text Char"/>
     <w:link w:val="FootnoteText"/>
     <w:uiPriority w:val="99"/>
@@ -4718,7 +4751,7 @@
     <w:semiHidden/>
     <w:unhideWhenUsed/>
   </w:style>
-  <w:style w:type="character" w:customStyle="1" w:styleId="EndnoteTextChar">
+  <w:style w:type="character" w:styleId="EndnoteTextChar" w:customStyle="1">
     <w:name w:val="Endnote Text Char"/>
     <w:link w:val="EndnoteText"/>
     <w:uiPriority w:val="99"/>
@@ -4733,7 +4766,7 @@
 </file>
 
 <file path=word/theme/theme1.xml><?xml version="1.0" encoding="utf-8"?>
-<a:theme xmlns:a="http://schemas.openxmlformats.org/drawingml/2006/main" name="Office Theme">
+<a:theme xmlns:a="http://schemas.openxmlformats.org/drawingml/2006/main" xmlns:thm15="http://schemas.microsoft.com/office/thememl/2012/main" name="Office Theme">
   <a:themeElements>
     <a:clrScheme name="Office">
       <a:dk1>

</xml_diff>